<commit_message>
Plugin Yêu cầu hỗ trợ: nút nổi mở bảng "Yêu cầu của tôi" trượt mép phải (bộ lọc trạng thái / màn / cả trường / ngày, tải thêm) đọc cửa /ho-tro/danh-sach; "Tạo yêu cầu mới" mới chụp + popup; Gửi nhanh về đúng bước 3a (iframe ẩn + postMessage) và chèn dòng mới; tài liệu docx thêm mục 10 (yêu cầu gửi Help) + 10.7 (Help trả lời)
Co-Authored-By: Claude Fable 5.1 <noreply@anthropic.com>
</commit_message>
<xml_diff>
--- a/nut-yeu-cau-ho-tro-tren-app.docx
+++ b/nut-yeu-cau-ho-tro-tren-app.docx
@@ -221,7 +221,7 @@
         <w:pStyle w:val="ListBullet"/>
       </w:pPr>
       <w:r>
-        <w:t>Ảnh chụp: chụp TỰ ĐỘNG lúc mở popup, hiện thu nhỏ. Có nút "Chụp lại" và ô "Dán ảnh khác (Ctrl+V)" để người dùng tự chụp bằng Win+Shift+S khi ảnh tự động không đạt.</w:t>
+        <w:t>Ảnh chụp: chụp TỰ ĐỘNG toàn màn hình lúc mở popup, hiện thu nhỏ. Nút "Sửa ảnh" mở công cụ kiểu Paint của app: đóng khung chỗ lỗi hoặc chỗ cần hỗ trợ, cắt đúng phần muốn gửi (chủ dự án chốt 26/10/2026). Có "Chụp lại" và ô "Dán ảnh khác (Ctrl+V)" làm đường lui.</w:t>
       </w:r>
     </w:p>
     <w:p>
@@ -229,7 +229,7 @@
         <w:pStyle w:val="ListBullet"/>
       </w:pPr>
       <w:r>
-        <w:t>Sửa ảnh: chụp xong phải có nút sửa ảnh dạng Paint để người dùng đóng khung hoặc vẽ mũi tên chỉ vào chỗ có vấn đề, và một nút Cắt ảnh để người dùng cắt đúng khu vực muốn gửi (không gửi cả màn hình khi không cần) trước khi gửi.</w:t>
+        <w:t>Help chỉ nhận tấm ảnh CUỐI sau khi sửa. Toàn bộ chụp, vẽ, cắt là việc của app; Help không có công cụ sửa ảnh.</w:t>
       </w:r>
     </w:p>
     <w:p>
@@ -261,7 +261,7 @@
         <w:pStyle w:val="ListBullet"/>
       </w:pPr>
       <w:r>
-        <w:t>Hai nút: "Gửi nhanh" và "Chi tiết hơn". Cả hai gửi cùng một form sang Help, chỉ khác giá trị cheDo.</w:t>
+        <w:t>Hai nút: "Gửi nhanh" và "Chi tiết hơn". Cả hai gửi cùng một form sang Help, chỉ khác giá trị cheDo và target. Gửi nhanh submit vào một iframe ẩn: người dùng ở lại phần mềm, popup hiện "Đã gửi" khi nhận được message từ Help. Chi tiết hơn submit vào tab help-portal: đây là nút duy nhất mở Help.</w:t>
       </w:r>
     </w:p>
     <w:p>
@@ -277,59 +277,7 @@
         <w:pStyle w:val="Heading2"/>
       </w:pPr>
       <w:r>
-        <w:t>Bước 3a — "Gửi nhanh": Help xác nhận và gợi ý trùng</w:t>
-      </w:r>
-    </w:p>
-    <w:p>
-      <w:pPr>
-        <w:jc w:val="center"/>
-      </w:pPr>
-      <w:r>
-        <w:drawing>
-          <wp:inline xmlns:a="http://schemas.openxmlformats.org/drawingml/2006/main" xmlns:pic="http://schemas.openxmlformats.org/drawingml/2006/picture">
-            <wp:extent cx="6332220" cy="3957638"/>
-            <wp:docPr id="3" name="Picture 3"/>
-            <wp:cNvGraphicFramePr>
-              <a:graphicFrameLocks noChangeAspect="1"/>
-            </wp:cNvGraphicFramePr>
-            <a:graphic>
-              <a:graphicData uri="http://schemas.openxmlformats.org/drawingml/2006/picture">
-                <pic:pic>
-                  <pic:nvPicPr>
-                    <pic:cNvPr id="0" name="03-help-gui-nhanh.png"/>
-                    <pic:cNvPicPr/>
-                  </pic:nvPicPr>
-                  <pic:blipFill>
-                    <a:blip r:embed="rId11"/>
-                    <a:stretch>
-                      <a:fillRect/>
-                    </a:stretch>
-                  </pic:blipFill>
-                  <pic:spPr>
-                    <a:xfrm>
-                      <a:off x="0" y="0"/>
-                      <a:ext cx="6332220" cy="3957638"/>
-                    </a:xfrm>
-                    <a:prstGeom prst="rect"/>
-                  </pic:spPr>
-                </pic:pic>
-              </a:graphicData>
-            </a:graphic>
-          </wp:inline>
-        </w:drawing>
-      </w:r>
-    </w:p>
-    <w:p>
-      <w:pPr>
-        <w:jc w:val="center"/>
-      </w:pPr>
-      <w:r>
-        <w:rPr>
-          <w:i/>
-          <w:color w:val="6B7280"/>
-          <w:sz w:val="18"/>
-        </w:rPr>
-        <w:t>Tab "help-portal" mở trang xác nhận trên Help. Nếu đã có người cùng trường, cùng màn hình, cùng phiên bản gặp đúng lỗi này thì hỏi một câu.</w:t>
+        <w:t>Bước 3a — "Gửi nhanh": tạo ngay, người dùng ở lại phần mềm</w:t>
       </w:r>
     </w:p>
     <w:p>
@@ -337,7 +285,7 @@
         <w:pStyle w:val="ListBullet"/>
       </w:pPr>
       <w:r>
-        <w:t>Help xác thực token y như đăng nhập SSO, nên người dùng có phiên Help ngay, không phải đăng nhập lại.</w:t>
+        <w:t>Form submit vào một iframe ẩn trong popup. Help xác thực token y như đăng nhập SSO, tạo yêu cầu NGAY, rồi trả về một trang nhỏ trong iframe; trang đó gửi postMessage { loai: "help-ho-tro-xong", ok, id, url, soTuongTu } cho popup.</w:t>
       </w:r>
     </w:p>
     <w:p>
@@ -345,7 +293,7 @@
         <w:pStyle w:val="ListBullet"/>
       </w:pPr>
       <w:r>
-        <w:t>Có yêu cầu tương tự: ba lựa chọn "Tôi cũng gặp lỗi này" (ảnh của người dùng được gắn vào yêu cầu đang xử lý), "Xem chi tiết", "Vấn đề của tôi khác" (tạo yêu cầu mới).</w:t>
+        <w:t>Popup hiện "Đã gửi yêu cầu" kèm link Xem (mở url trong tab help-portal nếu người dùng bấm). soTuongTu &gt; 0 thì nhắc "đã có N người báo lỗi ở màn này".</w:t>
       </w:r>
     </w:p>
     <w:p>
@@ -353,7 +301,7 @@
         <w:pStyle w:val="ListBullet"/>
       </w:pPr>
       <w:r>
-        <w:t>Không có yêu cầu tương tự: Help tạo yêu cầu NGAY và mở trang vấn đề (bước 4), không hỏi thêm.</w:t>
+        <w:t>Không có bước gợi ý trùng ở gửi nhanh — chủ dự án chốt 26/10/2026: gửi nhanh không được nhảy trang. Gợi ý trùng chỉ còn ở form Chi tiết hơn.</w:t>
       </w:r>
     </w:p>
     <w:p>
@@ -361,7 +309,7 @@
         <w:pStyle w:val="ListBullet"/>
       </w:pPr>
       <w:r>
-        <w:t>Gợi ý trùng chạy bên Help. Popup trong phần mềm không gọi API nào để gợi ý.</w:t>
+        <w:t>Popup chỉ tin message có event.origin là tên miền Help. Không nhận được trong khoảng 10 giây thì báo lỗi và cho bấm lại; ảnh và chữ vẫn còn.</w:t>
       </w:r>
     </w:p>
     <w:p>
@@ -380,7 +328,7 @@
         <w:drawing>
           <wp:inline xmlns:a="http://schemas.openxmlformats.org/drawingml/2006/main" xmlns:pic="http://schemas.openxmlformats.org/drawingml/2006/picture">
             <wp:extent cx="6332220" cy="4848106"/>
-            <wp:docPr id="4" name="Picture 4"/>
+            <wp:docPr id="3" name="Picture 3"/>
             <wp:cNvGraphicFramePr>
               <a:graphicFrameLocks noChangeAspect="1"/>
             </wp:cNvGraphicFramePr>
@@ -392,7 +340,7 @@
                     <pic:cNvPicPr/>
                   </pic:nvPicPr>
                   <pic:blipFill>
-                    <a:blip r:embed="rId12"/>
+                    <a:blip r:embed="rId11"/>
                     <a:stretch>
                       <a:fillRect/>
                     </a:stretch>
@@ -472,7 +420,7 @@
         <w:drawing>
           <wp:inline xmlns:a="http://schemas.openxmlformats.org/drawingml/2006/main" xmlns:pic="http://schemas.openxmlformats.org/drawingml/2006/picture">
             <wp:extent cx="6332220" cy="3957638"/>
-            <wp:docPr id="5" name="Picture 5"/>
+            <wp:docPr id="4" name="Picture 4"/>
             <wp:cNvGraphicFramePr>
               <a:graphicFrameLocks noChangeAspect="1"/>
             </wp:cNvGraphicFramePr>
@@ -484,7 +432,7 @@
                     <pic:cNvPicPr/>
                   </pic:nvPicPr>
                   <pic:blipFill>
-                    <a:blip r:embed="rId13"/>
+                    <a:blip r:embed="rId12"/>
                     <a:stretch>
                       <a:fillRect/>
                     </a:stretch>
@@ -628,7 +576,7 @@
               <w:rPr>
                 <w:sz w:val="19"/>
               </w:rPr>
-              <w:t>Nút nổi, popup, chụp ảnh</w:t>
+              <w:t>Nút nổi, popup, chụp ảnh, công cụ sửa ảnh (khung, cắt)</w:t>
             </w:r>
           </w:p>
         </w:tc>
@@ -931,7 +879,7 @@
     </w:p>
     <w:p>
       <w:r>
-        <w:t>Cả hai nút gửi cùng một form method="POST" enctype="multipart/form-data" target="help-portal" tới https://&lt;help&gt;/help-master/ho-tro/gui. Tên tab "help-portal" cố định, trùng với tab của nút "?", nên bấm gửi lần nữa thì đúng tab đó đổi nội dung.</w:t>
+        <w:t>Cả hai nút gửi cùng một form method="POST" enctype="multipart/form-data" tới https://con98.api-apis.com/help-master/ho-tro/gui — Help là cổng dùng chung nên địa chỉ giống nhau ở mọi trường (cửa đã có trên máy dev của Help từ 26/10/2026, chờ lên máy chủ). Khác nhau ở target: Gửi nhanh trỏ vào iframe ẩn (vd name="help-nhanh"), Chi tiết hơn trỏ vào tab "help-portal" — tên tab cố định, trùng với tab của nút "?".</w:t>
       </w:r>
     </w:p>
     <w:tbl>
@@ -1554,7 +1502,15 @@
         <w:pStyle w:val="ListBullet"/>
       </w:pPr>
       <w:r>
-        <w:t>Chụp ảnh bằng html2canvas phải gọi trên tài liệu BÊN TRONG iframe (iframe.contentDocument.body). Gọi từ shell thì ảnh ra khung trống đúng chỗ màn hình. Điều kiện: shell và iframe cùng nguồn (cùng host, cùng cổng). Đây là chỗ phải thử đầu tiên trên index.aspx thật.</w:t>
+        <w:t>Chụp ảnh bằng html2canvas phải gọi trên tài liệu BÊN TRONG iframe (iframe.contentDocument.body). Gọi từ shell thì ảnh ra khung trống đúng chỗ màn hình. Điều kiện cùng nguồn ĐÃ XÁC NHẬN (đối chiếu mã 26/10/2026): _v2/index.aspx nạp màn hình trong cùng host, nên đọc được contentDocument. Vẫn phải thử ảnh ra có đủ lưới dữ liệu không.</w:t>
+      </w:r>
+    </w:p>
+    <w:p>
+      <w:pPr>
+        <w:pStyle w:val="ListBullet"/>
+      </w:pPr>
+      <w:r>
+        <w:t>Thư viện html2canvas CHƯA có trong _v2/assets/vendor (đối chiếu mã 26/10/2026) — cần thêm vào, bản độc lập ~40 KB, không phụ thuộc gì khác.</w:t>
       </w:r>
     </w:p>
     <w:p>
@@ -1655,7 +1611,7 @@
     </w:p>
     <w:p>
       <w:r>
-        <w:t>Phía Help chưa dựng cửa /ho-tro/gui (đang chờ chốt vài điểm nghiệp vụ). Đội app làm được ngay và độc lập ba việc đầu:</w:t>
+        <w:t>Phía Help đã dựng xong cửa /ho-tro/gui, trang xác nhận, form đầy đủ, trang vấn đề và hàng đợi (26/10/2026, máy dev). Đội app làm độc lập ba việc đầu:</w:t>
       </w:r>
     </w:p>
     <w:p>
@@ -1687,7 +1643,7 @@
         <w:pStyle w:val="ListBullet"/>
       </w:pPr>
       <w:r>
-        <w:t>4. Khi Help có cửa nhận, Help báo địa chỉ thử; đổi action rồi chạy đầu-cuối bằng một tài khoản trường.</w:t>
+        <w:t>4. Khi bản Help này lên máy chủ, đổi action sang địa chỉ thật rồi chạy đầu-cuối bằng một tài khoản trường.</w:t>
       </w:r>
     </w:p>
     <w:p>
@@ -1700,33 +1656,204 @@
         <w:pStyle w:val="Heading1"/>
       </w:pPr>
       <w:r>
-        <w:t>8. Ba câu cần đội app trả lời</w:t>
+        <w:t>8. Câu hỏi với đội app — đã có đủ trả lời</w:t>
       </w:r>
     </w:p>
-    <w:p>
-      <w:pPr>
-        <w:pStyle w:val="ListBullet"/>
-      </w:pPr>
-      <w:r>
-        <w:t>Shell và iframe màn hình có cùng nguồn không (cùng host, cùng cổng)? Nếu không, html2canvas không chụp được và phải đổi cách.</w:t>
-      </w:r>
-    </w:p>
-    <w:p>
-      <w:pPr>
-        <w:pStyle w:val="ListBullet"/>
-      </w:pPr>
-      <w:r>
-        <w:t>Shell v2 đã có thư viện chụp ảnh nào chưa, hay cần thêm html2canvas?</w:t>
-      </w:r>
-    </w:p>
-    <w:p>
-      <w:pPr>
-        <w:pStyle w:val="ListBullet"/>
-      </w:pPr>
-      <w:r>
-        <w:t>Có muốn popup cho khoanh vùng ảnh (kéo hình chữ nhật như Win+Shift+S) ở bản đầu không? Đề nghị: chụp cả vùng đang hiện, khoanh vùng để sau.</w:t>
-      </w:r>
-    </w:p>
+    <w:tbl>
+      <w:tblPr>
+        <w:tblStyle w:val="TableGrid"/>
+        <w:tblW w:type="auto" w:w="0"/>
+        <w:tblLook w:firstColumn="1" w:firstRow="1" w:lastColumn="0" w:lastRow="0" w:noHBand="0" w:noVBand="1" w:val="04A0"/>
+      </w:tblPr>
+      <w:tblGrid>
+        <w:gridCol w:w="3324"/>
+        <w:gridCol w:w="3324"/>
+        <w:gridCol w:w="3324"/>
+      </w:tblGrid>
+      <w:tr>
+        <w:tc>
+          <w:tcPr>
+            <w:tcW w:type="dxa" w:w="3324"/>
+            <w:shd w:val="clear" w:color="auto" w:fill="EFF6FF"/>
+          </w:tcPr>
+          <w:p>
+            <w:r/>
+            <w:r>
+              <w:rPr>
+                <w:b/>
+                <w:sz w:val="19"/>
+              </w:rPr>
+              <w:t>Câu hỏi</w:t>
+            </w:r>
+          </w:p>
+        </w:tc>
+        <w:tc>
+          <w:tcPr>
+            <w:tcW w:type="dxa" w:w="3324"/>
+            <w:shd w:val="clear" w:color="auto" w:fill="EFF6FF"/>
+          </w:tcPr>
+          <w:p>
+            <w:r/>
+            <w:r>
+              <w:rPr>
+                <w:b/>
+                <w:sz w:val="19"/>
+              </w:rPr>
+              <w:t>Trả lời</w:t>
+            </w:r>
+          </w:p>
+        </w:tc>
+        <w:tc>
+          <w:tcPr>
+            <w:tcW w:type="dxa" w:w="3324"/>
+            <w:shd w:val="clear" w:color="auto" w:fill="EFF6FF"/>
+          </w:tcPr>
+          <w:p>
+            <w:r/>
+            <w:r>
+              <w:rPr>
+                <w:b/>
+                <w:sz w:val="19"/>
+              </w:rPr>
+              <w:t>Nguồn</w:t>
+            </w:r>
+          </w:p>
+        </w:tc>
+      </w:tr>
+      <w:tr>
+        <w:tc>
+          <w:tcPr>
+            <w:tcW w:type="dxa" w:w="3324"/>
+          </w:tcPr>
+          <w:p>
+            <w:r/>
+            <w:r>
+              <w:rPr>
+                <w:sz w:val="19"/>
+              </w:rPr>
+              <w:t>Shell và iframe màn hình có cùng nguồn không?</w:t>
+            </w:r>
+          </w:p>
+        </w:tc>
+        <w:tc>
+          <w:tcPr>
+            <w:tcW w:type="dxa" w:w="3324"/>
+          </w:tcPr>
+          <w:p>
+            <w:r/>
+            <w:r>
+              <w:rPr>
+                <w:sz w:val="19"/>
+              </w:rPr>
+              <w:t>CÓ — _v2/index.aspx nạp màn hình trong cùng host. html2canvas đọc được iframe.contentDocument.</w:t>
+            </w:r>
+          </w:p>
+        </w:tc>
+        <w:tc>
+          <w:tcPr>
+            <w:tcW w:type="dxa" w:w="3324"/>
+          </w:tcPr>
+          <w:p>
+            <w:r/>
+            <w:r>
+              <w:rPr>
+                <w:sz w:val="19"/>
+              </w:rPr>
+              <w:t>chủ dự án đối chiếu mã, 26/10/2026</w:t>
+            </w:r>
+          </w:p>
+        </w:tc>
+      </w:tr>
+      <w:tr>
+        <w:tc>
+          <w:tcPr>
+            <w:tcW w:type="dxa" w:w="3324"/>
+          </w:tcPr>
+          <w:p>
+            <w:r/>
+            <w:r>
+              <w:rPr>
+                <w:sz w:val="19"/>
+              </w:rPr>
+              <w:t>Shell v2 đã có thư viện chụp ảnh chưa?</w:t>
+            </w:r>
+          </w:p>
+        </w:tc>
+        <w:tc>
+          <w:tcPr>
+            <w:tcW w:type="dxa" w:w="3324"/>
+          </w:tcPr>
+          <w:p>
+            <w:r/>
+            <w:r>
+              <w:rPr>
+                <w:sz w:val="19"/>
+              </w:rPr>
+              <w:t>CHƯA — _v2/assets/vendor không có html2canvas. Cần thêm (bản độc lập ~40 KB).</w:t>
+            </w:r>
+          </w:p>
+        </w:tc>
+        <w:tc>
+          <w:tcPr>
+            <w:tcW w:type="dxa" w:w="3324"/>
+          </w:tcPr>
+          <w:p>
+            <w:r/>
+            <w:r>
+              <w:rPr>
+                <w:sz w:val="19"/>
+              </w:rPr>
+              <w:t>chủ dự án đối chiếu mã, 26/10/2026</w:t>
+            </w:r>
+          </w:p>
+        </w:tc>
+      </w:tr>
+      <w:tr>
+        <w:tc>
+          <w:tcPr>
+            <w:tcW w:type="dxa" w:w="3324"/>
+          </w:tcPr>
+          <w:p>
+            <w:r/>
+            <w:r>
+              <w:rPr>
+                <w:sz w:val="19"/>
+              </w:rPr>
+              <w:t>Có khoanh vùng ảnh ở bản đầu không?</w:t>
+            </w:r>
+          </w:p>
+        </w:tc>
+        <w:tc>
+          <w:tcPr>
+            <w:tcW w:type="dxa" w:w="3324"/>
+          </w:tcPr>
+          <w:p>
+            <w:r/>
+            <w:r>
+              <w:rPr>
+                <w:sz w:val="19"/>
+              </w:rPr>
+              <w:t>CÓ, và là việc của app: chụp toàn màn hình, công cụ sửa ảnh kiểu Paint để đóng khung chỗ lỗi và cắt đúng phần cần hỗ trợ. Help chỉ nhận ảnh cuối.</w:t>
+            </w:r>
+          </w:p>
+        </w:tc>
+        <w:tc>
+          <w:tcPr>
+            <w:tcW w:type="dxa" w:w="3324"/>
+          </w:tcPr>
+          <w:p>
+            <w:r/>
+            <w:r>
+              <w:rPr>
+                <w:sz w:val="19"/>
+              </w:rPr>
+              <w:t>chủ dự án chốt, 26/10/2026</w:t>
+            </w:r>
+          </w:p>
+        </w:tc>
+      </w:tr>
+    </w:tbl>
+    <w:p/>
     <w:p>
       <w:pPr>
         <w:pStyle w:val="Heading1"/>
@@ -1740,6 +1867,2060 @@
         <w:t>Yêu cầu hỗ trợ nối với màn hình qua ma = CHUCNANG.ID. Help lưu toàn bộ lịch sử vấn đề của từng màn theo khóa đó. Đánh số lại ID, gộp hay xóa dòng CHUCNANG khi lên bản mới là lịch sử đó rời khỏi màn hình. Giữ ID và MACHUCNANG qua mọi phiên bản; DUONGDANFILE đổi thoải mái. Tài liệu riêng về các trường bắt buộc trong tệp xuất mapping sẽ gửi sau.</w:t>
       </w:r>
     </w:p>
+    <w:p>
+      <w:pPr>
+        <w:pStyle w:val="Heading1"/>
+      </w:pPr>
+      <w:r>
+        <w:t xml:space="preserve">10. Bổ sung 26/10/2026 (đội app → Help): bảng "Yêu cầu của tôi" ngay trong phần mềm</w:t>
+      </w:r>
+    </w:p>
+    <w:tbl>
+      <w:tblPr>
+        <w:tblW w:type="auto" w:w="0"/>
+        <w:tblLook w:firstColumn="1" w:firstRow="1" w:lastColumn="0" w:lastRow="0" w:noHBand="0" w:noVBand="1" w:val="04A0"/>
+      </w:tblPr>
+      <w:tblGrid>
+        <w:gridCol w:w="9972"/>
+      </w:tblGrid>
+      <w:tr>
+        <w:tc>
+          <w:tcPr>
+            <w:tcW w:type="dxa" w:w="9972"/>
+            <w:shd w:val="clear" w:color="auto" w:fill="FFFBEB"/>
+          </w:tcPr>
+          <w:p>
+            <w:r>
+              <w:rPr>
+                <w:sz w:val="19"/>
+              </w:rPr>
+              <w:t xml:space="preserve">Mục này do đội app viết sau khi chủ dự án chốt cách bấm nút mới (26/10/2026). Nó THAY đoạn "Bấm vào thì mở popup ở bước 2" ở bước 1 và thêm MỘT ngoại lệ cho mục 6. Mọi mục khác (form gửi, token, bước 3a/3b, trang vấn đề) giữ nguyên. Help cần làm đúng một việc mới: cửa trả JSON ở 10.2, kèm CORS ở 10.3.</w:t>
+            </w:r>
+          </w:p>
+        </w:tc>
+      </w:tr>
+    </w:tbl>
+    <w:p/>
+    <w:p>
+      <w:r>
+        <w:t xml:space="preserve">Lý do: người dùng đã gửi yêu cầu rồi không có chỗ nào trong phần mềm để biết yêu cầu đó đang ở trạng thái gì, phải mở tab Help và tự tìm. Chủ dự án muốn bấm nút nổi là thấy ngay danh sách yêu cầu của mình kèm trạng thái, có bộ lọc; chỉ khi bấm "Tạo yêu cầu mới" ở cuối danh sách mới chụp ảnh và mở popup như bước 2 hiện tại. Danh sách và trạng thái nằm hoàn toàn bên Help, phần mềm không lưu gì, nên phải có một cửa đọc dữ liệu.</w:t>
+      </w:r>
+    </w:p>
+    <w:p>
+      <w:pPr>
+        <w:pStyle w:val="Heading2"/>
+      </w:pPr>
+      <w:r>
+        <w:t xml:space="preserve">10.1 Luồng mới ở bước 1 (thay cho "bấm là mở popup")</w:t>
+      </w:r>
+    </w:p>
+    <w:p>
+      <w:pPr>
+        <w:pStyle w:val="ListBullet"/>
+      </w:pPr>
+      <w:r>
+        <w:t xml:space="preserve">Bấm nút nổi → một bảng trượt ra sát mép phải, rộng khoảng 400px, đè lên màn hình đang mở, không đẩy nội dung. Bấm ra ngoài hoặc Esc thì đóng.</w:t>
+      </w:r>
+    </w:p>
+    <w:p>
+      <w:pPr>
+        <w:pStyle w:val="ListBullet"/>
+      </w:pPr>
+      <w:r>
+        <w:t xml:space="preserve">Trên cùng bảng là bộ lọc: nhóm nút trạng thái (lấy từ danh mục Help trả về, xem 10.2), công tắc "Chỉ màn đang mở", ô tìm theo chữ, khoảng ngày cập nhật. Đổi bộ lọc là gọi lại cửa 10.2 với tham số mới; phần mềm KHÔNG lọc tại chỗ để phân trang đúng.</w:t>
+      </w:r>
+    </w:p>
+    <w:p>
+      <w:pPr>
+        <w:pStyle w:val="ListBullet"/>
+      </w:pPr>
+      <w:r>
+        <w:t xml:space="preserve">Giữa là danh sách, mỗi dòng: nhãn trạng thái (màu theo Help), tiêu đề hoặc đoạn đầu mô tả, tên màn hình, ngày cập nhật, số phản hồi chưa đọc. Bấm dòng → mở url của yêu cầu ở tab help-portal (tab cố định, trùng nút "?").</w:t>
+      </w:r>
+    </w:p>
+    <w:p>
+      <w:pPr>
+        <w:pStyle w:val="ListBullet"/>
+      </w:pPr>
+      <w:r>
+        <w:t xml:space="preserve">Dưới cùng cố định nút "Tạo yêu cầu mới" → lúc này mới chụp màn hình (bảng tự ẩn khỏi ảnh) và mở popup bước 2. Từ đây về sau đúng như tài liệu: bước 2 → 3a / 3b → 4.</w:t>
+      </w:r>
+    </w:p>
+    <w:p>
+      <w:pPr>
+        <w:pStyle w:val="ListBullet"/>
+      </w:pPr>
+      <w:r>
+        <w:t xml:space="preserve">Gửi nhanh xong (bước 3a) phần mềm chèn ngay dòng mới lên đầu danh sách bằng id, url Help trả qua postMessage, không gọi lại cửa 10.2. Vì vậy postMessage { loai: "help-ho-tro-xong", ok, id, url, soTuongTu } ở bước 3a nay là bắt buộc, không phải tùy chọn.</w:t>
+      </w:r>
+    </w:p>
+    <w:p>
+      <w:pPr>
+        <w:pStyle w:val="ListBullet"/>
+      </w:pPr>
+      <w:r>
+        <w:t xml:space="preserve">Phần mềm chỉ gọi cửa 10.2 khi người dùng mở bảng hoặc đổi bộ lọc (gõ chữ có trễ 400 ms). Không gọi nền, không gọi định kỳ, không hiện số đếm trên nút nổi.</w:t>
+      </w:r>
+    </w:p>
+    <w:p>
+      <w:pPr>
+        <w:pStyle w:val="Heading2"/>
+      </w:pPr>
+      <w:r>
+        <w:t xml:space="preserve">10.2 Cửa Help cần làm: POST https://con98.api-apis.com/help-master/ho-tro/danh-sach</w:t>
+      </w:r>
+    </w:p>
+    <w:p>
+      <w:r>
+        <w:t xml:space="preserve">Cùng nguyên tắc với cửa /ho-tro/gui: xác thực bằng token SSO phát MỚI mỗi lần gọi (cùng claim, aud = help-master), token nằm trong body (application/x-www-form-urlencoded hoặc JSON), không bao giờ trên URL. Người dùng là ai lấy từ token, phần mềm không gửi id người dùng. Trả về application/json; charset=utf-8.</w:t>
+      </w:r>
+    </w:p>
+    <w:tbl>
+      <w:tblPr>
+        <w:tblStyle w:val="TableGrid"/>
+        <w:tblW w:type="auto" w:w="0"/>
+        <w:tblLook w:firstColumn="1" w:firstRow="1" w:lastColumn="0" w:lastRow="0" w:noHBand="0" w:noVBand="1" w:val="04A0"/>
+      </w:tblPr>
+      <w:tblGrid>
+        <w:gridCol w:w="2200"/>
+        <w:gridCol w:w="1100"/>
+        <w:gridCol w:w="6672"/>
+      </w:tblGrid>
+      <w:tr>
+        <w:tc>
+          <w:tcPr>
+            <w:tcW w:type="dxa" w:w="2200"/>
+            <w:shd w:val="clear" w:color="auto" w:fill="EFF6FF"/>
+          </w:tcPr>
+          <w:p>
+            <w:r/>
+            <w:r>
+              <w:rPr>
+                <w:b/>
+                <w:sz w:val="19"/>
+              </w:rPr>
+              <w:t xml:space="preserve">Tham số gửi</w:t>
+            </w:r>
+          </w:p>
+        </w:tc>
+        <w:tc>
+          <w:tcPr>
+            <w:tcW w:type="dxa" w:w="1100"/>
+            <w:shd w:val="clear" w:color="auto" w:fill="EFF6FF"/>
+          </w:tcPr>
+          <w:p>
+            <w:r/>
+            <w:r>
+              <w:rPr>
+                <w:b/>
+                <w:sz w:val="19"/>
+              </w:rPr>
+              <w:t xml:space="preserve">Bắt buộc</w:t>
+            </w:r>
+          </w:p>
+        </w:tc>
+        <w:tc>
+          <w:tcPr>
+            <w:tcW w:type="dxa" w:w="6672"/>
+            <w:shd w:val="clear" w:color="auto" w:fill="EFF6FF"/>
+          </w:tcPr>
+          <w:p>
+            <w:r/>
+            <w:r>
+              <w:rPr>
+                <w:b/>
+                <w:sz w:val="19"/>
+              </w:rPr>
+              <w:t xml:space="preserve">Ghi chú</w:t>
+            </w:r>
+          </w:p>
+        </w:tc>
+      </w:tr>
+      <w:tr>
+        <w:tc>
+          <w:tcPr>
+            <w:tcW w:type="dxa" w:w="2200"/>
+          </w:tcPr>
+          <w:p>
+            <w:r/>
+            <w:r>
+              <w:rPr>
+                <w:sz w:val="19"/>
+              </w:rPr>
+              <w:t xml:space="preserve">token</w:t>
+            </w:r>
+          </w:p>
+        </w:tc>
+        <w:tc>
+          <w:tcPr>
+            <w:tcW w:type="dxa" w:w="1100"/>
+          </w:tcPr>
+          <w:p>
+            <w:r/>
+            <w:r>
+              <w:rPr>
+                <w:sz w:val="19"/>
+              </w:rPr>
+              <w:t xml:space="preserve">Có</w:t>
+            </w:r>
+          </w:p>
+        </w:tc>
+        <w:tc>
+          <w:tcPr>
+            <w:tcW w:type="dxa" w:w="6672"/>
+          </w:tcPr>
+          <w:p>
+            <w:r/>
+            <w:r>
+              <w:rPr>
+                <w:sz w:val="19"/>
+              </w:rPr>
+              <w:t xml:space="preserve">token SSO như cửa gửi, phát MỚI mỗi lần gọi; hết hạn → 401 và mã lỗi token-het-han</w:t>
+            </w:r>
+          </w:p>
+        </w:tc>
+      </w:tr>
+      <w:tr>
+        <w:tc>
+          <w:tcPr>
+            <w:tcW w:type="dxa" w:w="2200"/>
+          </w:tcPr>
+          <w:p>
+            <w:r/>
+            <w:r>
+              <w:rPr>
+                <w:sz w:val="19"/>
+              </w:rPr>
+              <w:t xml:space="preserve">v</w:t>
+            </w:r>
+          </w:p>
+        </w:tc>
+        <w:tc>
+          <w:tcPr>
+            <w:tcW w:type="dxa" w:w="1100"/>
+          </w:tcPr>
+          <w:p>
+            <w:r/>
+            <w:r>
+              <w:rPr>
+                <w:sz w:val="19"/>
+              </w:rPr>
+              <w:t xml:space="preserve">Có</w:t>
+            </w:r>
+          </w:p>
+        </w:tc>
+        <w:tc>
+          <w:tcPr>
+            <w:tcW w:type="dxa" w:w="6672"/>
+          </w:tcPr>
+          <w:p>
+            <w:r/>
+            <w:r>
+              <w:rPr>
+                <w:sz w:val="19"/>
+              </w:rPr>
+              <w:t xml:space="preserve">phiên bản phần mềm đang chạy: "1" hoặc "2"; để nhân viên biết và để lọc đúng mapping màn</w:t>
+            </w:r>
+          </w:p>
+        </w:tc>
+      </w:tr>
+      <w:tr>
+        <w:tc>
+          <w:tcPr>
+            <w:tcW w:type="dxa" w:w="2200"/>
+          </w:tcPr>
+          <w:p>
+            <w:r/>
+            <w:r>
+              <w:rPr>
+                <w:sz w:val="19"/>
+              </w:rPr>
+              <w:t xml:space="preserve">phamVi</w:t>
+            </w:r>
+          </w:p>
+        </w:tc>
+        <w:tc>
+          <w:tcPr>
+            <w:tcW w:type="dxa" w:w="1100"/>
+          </w:tcPr>
+          <w:p>
+            <w:r/>
+            <w:r>
+              <w:rPr>
+                <w:sz w:val="19"/>
+              </w:rPr>
+              <w:t xml:space="preserve">Không</w:t>
+            </w:r>
+          </w:p>
+        </w:tc>
+        <w:tc>
+          <w:tcPr>
+            <w:tcW w:type="dxa" w:w="6672"/>
+          </w:tcPr>
+          <w:p>
+            <w:r/>
+            <w:r>
+              <w:rPr>
+                <w:sz w:val="19"/>
+              </w:rPr>
+              <w:t xml:space="preserve">"toi" (mặc định): chỉ yêu cầu do chính người này tạo · "truong": mọi yêu cầu người cùng ứng dụng ở trường thấy được, theo đúng quyền Help đang áp (dòng nhắc ở bước 2). Help không muốn mở "truong" thì trả rỗng, phần mềm ẩn công tắc</w:t>
+            </w:r>
+          </w:p>
+        </w:tc>
+      </w:tr>
+      <w:tr>
+        <w:tc>
+          <w:tcPr>
+            <w:tcW w:type="dxa" w:w="2200"/>
+          </w:tcPr>
+          <w:p>
+            <w:r/>
+            <w:r>
+              <w:rPr>
+                <w:sz w:val="19"/>
+              </w:rPr>
+              <w:t xml:space="preserve">ma</w:t>
+            </w:r>
+          </w:p>
+        </w:tc>
+        <w:tc>
+          <w:tcPr>
+            <w:tcW w:type="dxa" w:w="1100"/>
+          </w:tcPr>
+          <w:p>
+            <w:r/>
+            <w:r>
+              <w:rPr>
+                <w:sz w:val="19"/>
+              </w:rPr>
+              <w:t xml:space="preserve">Không</w:t>
+            </w:r>
+          </w:p>
+        </w:tc>
+        <w:tc>
+          <w:tcPr>
+            <w:tcW w:type="dxa" w:w="6672"/>
+          </w:tcPr>
+          <w:p>
+            <w:r/>
+            <w:r>
+              <w:rPr>
+                <w:sz w:val="19"/>
+              </w:rPr>
+              <w:t xml:space="preserve">có giá trị thì chỉ trả yêu cầu của màn này (CHUCNANG.ID, cùng giá trị gửi ở /ho-tro/gui); dùng cho công tắc "Chỉ màn đang mở"</w:t>
+            </w:r>
+          </w:p>
+        </w:tc>
+      </w:tr>
+      <w:tr>
+        <w:tc>
+          <w:tcPr>
+            <w:tcW w:type="dxa" w:w="2200"/>
+          </w:tcPr>
+          <w:p>
+            <w:r/>
+            <w:r>
+              <w:rPr>
+                <w:sz w:val="19"/>
+              </w:rPr>
+              <w:t xml:space="preserve">trangThai</w:t>
+            </w:r>
+          </w:p>
+        </w:tc>
+        <w:tc>
+          <w:tcPr>
+            <w:tcW w:type="dxa" w:w="1100"/>
+          </w:tcPr>
+          <w:p>
+            <w:r/>
+            <w:r>
+              <w:rPr>
+                <w:sz w:val="19"/>
+              </w:rPr>
+              <w:t xml:space="preserve">Không</w:t>
+            </w:r>
+          </w:p>
+        </w:tc>
+        <w:tc>
+          <w:tcPr>
+            <w:tcW w:type="dxa" w:w="6672"/>
+          </w:tcPr>
+          <w:p>
+            <w:r/>
+            <w:r>
+              <w:rPr>
+                <w:sz w:val="19"/>
+              </w:rPr>
+              <w:t xml:space="preserve">một hoặc nhiều mã trạng thái cách nhau dấu phẩy, mã lấy từ danh mục Help trả về; rỗng = tất cả</w:t>
+            </w:r>
+          </w:p>
+        </w:tc>
+      </w:tr>
+      <w:tr>
+        <w:tc>
+          <w:tcPr>
+            <w:tcW w:type="dxa" w:w="2200"/>
+          </w:tcPr>
+          <w:p>
+            <w:r/>
+            <w:r>
+              <w:rPr>
+                <w:sz w:val="19"/>
+              </w:rPr>
+              <w:t xml:space="preserve">tuKhoa</w:t>
+            </w:r>
+          </w:p>
+        </w:tc>
+        <w:tc>
+          <w:tcPr>
+            <w:tcW w:type="dxa" w:w="1100"/>
+          </w:tcPr>
+          <w:p>
+            <w:r/>
+            <w:r>
+              <w:rPr>
+                <w:sz w:val="19"/>
+              </w:rPr>
+              <w:t xml:space="preserve">Không</w:t>
+            </w:r>
+          </w:p>
+        </w:tc>
+        <w:tc>
+          <w:tcPr>
+            <w:tcW w:type="dxa" w:w="6672"/>
+          </w:tcPr>
+          <w:p>
+            <w:r/>
+            <w:r>
+              <w:rPr>
+                <w:sz w:val="19"/>
+              </w:rPr>
+              <w:t xml:space="preserve">tìm trong tiêu đề và mô tả, không phân biệt hoa thường, ≤ 100 ký tự</w:t>
+            </w:r>
+          </w:p>
+        </w:tc>
+      </w:tr>
+      <w:tr>
+        <w:tc>
+          <w:tcPr>
+            <w:tcW w:type="dxa" w:w="2200"/>
+          </w:tcPr>
+          <w:p>
+            <w:r/>
+            <w:r>
+              <w:rPr>
+                <w:sz w:val="19"/>
+              </w:rPr>
+              <w:t xml:space="preserve">tuNgay, denNgay</w:t>
+            </w:r>
+          </w:p>
+        </w:tc>
+        <w:tc>
+          <w:tcPr>
+            <w:tcW w:type="dxa" w:w="1100"/>
+          </w:tcPr>
+          <w:p>
+            <w:r/>
+            <w:r>
+              <w:rPr>
+                <w:sz w:val="19"/>
+              </w:rPr>
+              <w:t xml:space="preserve">Không</w:t>
+            </w:r>
+          </w:p>
+        </w:tc>
+        <w:tc>
+          <w:tcPr>
+            <w:tcW w:type="dxa" w:w="6672"/>
+          </w:tcPr>
+          <w:p>
+            <w:r/>
+            <w:r>
+              <w:rPr>
+                <w:sz w:val="19"/>
+              </w:rPr>
+              <w:t xml:space="preserve">dd/MM/yyyy, lọc theo ngày cập nhật; thiếu một đầu thì mở đầu đó</w:t>
+            </w:r>
+          </w:p>
+        </w:tc>
+      </w:tr>
+      <w:tr>
+        <w:tc>
+          <w:tcPr>
+            <w:tcW w:type="dxa" w:w="2200"/>
+          </w:tcPr>
+          <w:p>
+            <w:r/>
+            <w:r>
+              <w:rPr>
+                <w:sz w:val="19"/>
+              </w:rPr>
+              <w:t xml:space="preserve">trang, kichCo</w:t>
+            </w:r>
+          </w:p>
+        </w:tc>
+        <w:tc>
+          <w:tcPr>
+            <w:tcW w:type="dxa" w:w="1100"/>
+          </w:tcPr>
+          <w:p>
+            <w:r/>
+            <w:r>
+              <w:rPr>
+                <w:sz w:val="19"/>
+              </w:rPr>
+              <w:t xml:space="preserve">Không</w:t>
+            </w:r>
+          </w:p>
+        </w:tc>
+        <w:tc>
+          <w:tcPr>
+            <w:tcW w:type="dxa" w:w="6672"/>
+          </w:tcPr>
+          <w:p>
+            <w:r/>
+            <w:r>
+              <w:rPr>
+                <w:sz w:val="19"/>
+              </w:rPr>
+              <w:t xml:space="preserve">phân trang, mặc định 1 và 20; kichCo tối đa 50. Sắp xếp theo ngày cập nhật giảm dần</w:t>
+            </w:r>
+          </w:p>
+        </w:tc>
+      </w:tr>
+    </w:tbl>
+    <w:p/>
+    <w:p>
+      <w:r>
+        <w:t xml:space="preserve">Trả về khi thành công (HTTP 200):</w:t>
+      </w:r>
+    </w:p>
+    <w:p>
+      <w:pPr>
+        <w:shd w:val="clear" w:color="auto" w:fill="F3F4F6"/>
+        <w:spacing w:before="0" w:after="0"/>
+      </w:pPr>
+      <w:r>
+        <w:rPr>
+          <w:rFonts w:ascii="Consolas" w:hAnsi="Consolas"/>
+          <w:sz w:val="17"/>
+        </w:rPr>
+        <w:t xml:space="preserve">{</w:t>
+      </w:r>
+    </w:p>
+    <w:p>
+      <w:pPr>
+        <w:shd w:val="clear" w:color="auto" w:fill="F3F4F6"/>
+        <w:spacing w:before="0" w:after="0"/>
+      </w:pPr>
+      <w:r>
+        <w:rPr>
+          <w:rFonts w:ascii="Consolas" w:hAnsi="Consolas"/>
+          <w:sz w:val="17"/>
+        </w:rPr>
+        <w:t xml:space="preserve">  "ok": true, "tong": 37, "trang": 1, "kichCo": 20,</w:t>
+      </w:r>
+    </w:p>
+    <w:p>
+      <w:pPr>
+        <w:shd w:val="clear" w:color="auto" w:fill="F3F4F6"/>
+        <w:spacing w:before="0" w:after="0"/>
+      </w:pPr>
+      <w:r>
+        <w:rPr>
+          <w:rFonts w:ascii="Consolas" w:hAnsi="Consolas"/>
+          <w:sz w:val="17"/>
+        </w:rPr>
+        <w:t xml:space="preserve">  "trangThai": [ { "ma": "moi", "ten": "Mới", "mau": "#2563EB" }, { "ma": "dang-xu-ly", "ten": "Đang xử lý", "mau": "#D97706" }, … ],</w:t>
+      </w:r>
+    </w:p>
+    <w:p>
+      <w:pPr>
+        <w:shd w:val="clear" w:color="auto" w:fill="F3F4F6"/>
+        <w:spacing w:before="0" w:after="0"/>
+      </w:pPr>
+      <w:r>
+        <w:rPr>
+          <w:rFonts w:ascii="Consolas" w:hAnsi="Consolas"/>
+          <w:sz w:val="17"/>
+        </w:rPr>
+        <w:t xml:space="preserve">  "ds": [ {</w:t>
+      </w:r>
+    </w:p>
+    <w:p>
+      <w:pPr>
+        <w:shd w:val="clear" w:color="auto" w:fill="F3F4F6"/>
+        <w:spacing w:before="0" w:after="0"/>
+      </w:pPr>
+      <w:r>
+        <w:rPr>
+          <w:rFonts w:ascii="Consolas" w:hAnsi="Consolas"/>
+          <w:sz w:val="17"/>
+        </w:rPr>
+        <w:t xml:space="preserve">      "id": "HT-2026-01234", "url": "https://con98.api-apis.com/help-master/van-de/HT-2026-01234",</w:t>
+      </w:r>
+    </w:p>
+    <w:p>
+      <w:pPr>
+        <w:shd w:val="clear" w:color="auto" w:fill="F3F4F6"/>
+        <w:spacing w:before="0" w:after="0"/>
+      </w:pPr>
+      <w:r>
+        <w:rPr>
+          <w:rFonts w:ascii="Consolas" w:hAnsi="Consolas"/>
+          <w:sz w:val="17"/>
+        </w:rPr>
+        <w:t xml:space="preserve">      "tieuDe": "Không lưu được phiếu thu", "moTa": "Bấm Lưu thì báo lỗi …",</w:t>
+      </w:r>
+    </w:p>
+    <w:p>
+      <w:pPr>
+        <w:shd w:val="clear" w:color="auto" w:fill="F3F4F6"/>
+        <w:spacing w:before="0" w:after="0"/>
+      </w:pPr>
+      <w:r>
+        <w:rPr>
+          <w:rFonts w:ascii="Consolas" w:hAnsi="Consolas"/>
+          <w:sz w:val="17"/>
+        </w:rPr>
+        <w:t xml:space="preserve">      "ma": "B2042224DB1D4AA6BC11B65EED062359", "ten": "Thu tiền", "v": "2",</w:t>
+      </w:r>
+    </w:p>
+    <w:p>
+      <w:pPr>
+        <w:shd w:val="clear" w:color="auto" w:fill="F3F4F6"/>
+        <w:spacing w:before="0" w:after="0"/>
+      </w:pPr>
+      <w:r>
+        <w:rPr>
+          <w:rFonts w:ascii="Consolas" w:hAnsi="Consolas"/>
+          <w:sz w:val="17"/>
+        </w:rPr>
+        <w:t xml:space="preserve">      "trangThai": "dang-xu-ly", "ngayTao": "26/10/2026 09:12", "ngayCapNhat": "26/10/2026 14:40",</w:t>
+      </w:r>
+    </w:p>
+    <w:p>
+      <w:pPr>
+        <w:shd w:val="clear" w:color="auto" w:fill="F3F4F6"/>
+        <w:spacing w:before="0" w:after="0"/>
+      </w:pPr>
+      <w:r>
+        <w:rPr>
+          <w:rFonts w:ascii="Consolas" w:hAnsi="Consolas"/>
+          <w:sz w:val="17"/>
+        </w:rPr>
+        <w:t xml:space="preserve">      "soPhanHoiMoi": 2, "nguoiPhuTrach": "Nguyễn Văn A", "cuaToi": true</w:t>
+      </w:r>
+    </w:p>
+    <w:p>
+      <w:pPr>
+        <w:shd w:val="clear" w:color="auto" w:fill="F3F4F6"/>
+        <w:spacing w:before="0" w:after="0"/>
+      </w:pPr>
+      <w:r>
+        <w:rPr>
+          <w:rFonts w:ascii="Consolas" w:hAnsi="Consolas"/>
+          <w:sz w:val="17"/>
+        </w:rPr>
+        <w:t xml:space="preserve">  } ]</w:t>
+      </w:r>
+    </w:p>
+    <w:p>
+      <w:pPr>
+        <w:shd w:val="clear" w:color="auto" w:fill="F3F4F6"/>
+        <w:spacing w:before="0" w:after="0"/>
+      </w:pPr>
+      <w:r>
+        <w:rPr>
+          <w:rFonts w:ascii="Consolas" w:hAnsi="Consolas"/>
+          <w:sz w:val="17"/>
+        </w:rPr>
+        <w:t xml:space="preserve">}</w:t>
+      </w:r>
+    </w:p>
+    <w:p/>
+    <w:tbl>
+      <w:tblPr>
+        <w:tblStyle w:val="TableGrid"/>
+        <w:tblW w:type="auto" w:w="0"/>
+        <w:tblLook w:firstColumn="1" w:firstRow="1" w:lastColumn="0" w:lastRow="0" w:noHBand="0" w:noVBand="1" w:val="04A0"/>
+      </w:tblPr>
+      <w:tblGrid>
+        <w:gridCol w:w="2800"/>
+        <w:gridCol w:w="7172"/>
+      </w:tblGrid>
+      <w:tr>
+        <w:tc>
+          <w:tcPr>
+            <w:tcW w:type="dxa" w:w="2800"/>
+            <w:shd w:val="clear" w:color="auto" w:fill="EFF6FF"/>
+          </w:tcPr>
+          <w:p>
+            <w:r/>
+            <w:r>
+              <w:rPr>
+                <w:b/>
+                <w:sz w:val="19"/>
+              </w:rPr>
+              <w:t xml:space="preserve">Trường trả về</w:t>
+            </w:r>
+          </w:p>
+        </w:tc>
+        <w:tc>
+          <w:tcPr>
+            <w:tcW w:type="dxa" w:w="7172"/>
+            <w:shd w:val="clear" w:color="auto" w:fill="EFF6FF"/>
+          </w:tcPr>
+          <w:p>
+            <w:r/>
+            <w:r>
+              <w:rPr>
+                <w:b/>
+                <w:sz w:val="19"/>
+              </w:rPr>
+              <w:t xml:space="preserve">Ghi chú</w:t>
+            </w:r>
+          </w:p>
+        </w:tc>
+      </w:tr>
+      <w:tr>
+        <w:tc>
+          <w:tcPr>
+            <w:tcW w:type="dxa" w:w="2800"/>
+          </w:tcPr>
+          <w:p>
+            <w:r/>
+            <w:r>
+              <w:rPr>
+                <w:sz w:val="19"/>
+              </w:rPr>
+              <w:t xml:space="preserve">trangThai (danh mục)</w:t>
+            </w:r>
+          </w:p>
+        </w:tc>
+        <w:tc>
+          <w:tcPr>
+            <w:tcW w:type="dxa" w:w="7172"/>
+          </w:tcPr>
+          <w:p>
+            <w:r/>
+            <w:r>
+              <w:rPr>
+                <w:sz w:val="19"/>
+              </w:rPr>
+              <w:t xml:space="preserve">LUÔN trả kèm trong mọi phản hồi, cả khi ds rỗng: mã, tên hiển thị, màu hex. Phần mềm vẽ nhóm nút lọc và nhãn theo đúng bộ này, nên Help thêm / đổi tên trạng thái không cần sửa phần mềm. Thứ tự trả về là thứ tự hiện</w:t>
+            </w:r>
+          </w:p>
+        </w:tc>
+      </w:tr>
+      <w:tr>
+        <w:tc>
+          <w:tcPr>
+            <w:tcW w:type="dxa" w:w="2800"/>
+          </w:tcPr>
+          <w:p>
+            <w:r/>
+            <w:r>
+              <w:rPr>
+                <w:sz w:val="19"/>
+              </w:rPr>
+              <w:t xml:space="preserve">ds[].id, url</w:t>
+            </w:r>
+          </w:p>
+        </w:tc>
+        <w:tc>
+          <w:tcPr>
+            <w:tcW w:type="dxa" w:w="7172"/>
+          </w:tcPr>
+          <w:p>
+            <w:r/>
+            <w:r>
+              <w:rPr>
+                <w:sz w:val="19"/>
+              </w:rPr>
+              <w:t xml:space="preserve">id hiển thị cho người dùng; url mở ở tab help-portal, Help tự lo đăng nhập SSO khi mở (như nút "?")</w:t>
+            </w:r>
+          </w:p>
+        </w:tc>
+      </w:tr>
+      <w:tr>
+        <w:tc>
+          <w:tcPr>
+            <w:tcW w:type="dxa" w:w="2800"/>
+          </w:tcPr>
+          <w:p>
+            <w:r/>
+            <w:r>
+              <w:rPr>
+                <w:sz w:val="19"/>
+              </w:rPr>
+              <w:t xml:space="preserve">ds[].tieuDe, moTa</w:t>
+            </w:r>
+          </w:p>
+        </w:tc>
+        <w:tc>
+          <w:tcPr>
+            <w:tcW w:type="dxa" w:w="7172"/>
+          </w:tcPr>
+          <w:p>
+            <w:r/>
+            <w:r>
+              <w:rPr>
+                <w:sz w:val="19"/>
+              </w:rPr>
+              <w:t xml:space="preserve">chữ thuần, Help cắt moTa về ≤ 160 ký tự; phần mềm hiện tieuDe, không có thì hiện moTa</w:t>
+            </w:r>
+          </w:p>
+        </w:tc>
+      </w:tr>
+      <w:tr>
+        <w:tc>
+          <w:tcPr>
+            <w:tcW w:type="dxa" w:w="2800"/>
+          </w:tcPr>
+          <w:p>
+            <w:r/>
+            <w:r>
+              <w:rPr>
+                <w:sz w:val="19"/>
+              </w:rPr>
+              <w:t xml:space="preserve">ds[].ma, ten, v</w:t>
+            </w:r>
+          </w:p>
+        </w:tc>
+        <w:tc>
+          <w:tcPr>
+            <w:tcW w:type="dxa" w:w="7172"/>
+          </w:tcPr>
+          <w:p>
+            <w:r/>
+            <w:r>
+              <w:rPr>
+                <w:sz w:val="19"/>
+              </w:rPr>
+              <w:t xml:space="preserve">màn hình đã gửi lúc tạo; phần mềm hiện ten, không tra lại</w:t>
+            </w:r>
+          </w:p>
+        </w:tc>
+      </w:tr>
+      <w:tr>
+        <w:tc>
+          <w:tcPr>
+            <w:tcW w:type="dxa" w:w="2800"/>
+          </w:tcPr>
+          <w:p>
+            <w:r/>
+            <w:r>
+              <w:rPr>
+                <w:sz w:val="19"/>
+              </w:rPr>
+              <w:t xml:space="preserve">ds[].trangThai</w:t>
+            </w:r>
+          </w:p>
+        </w:tc>
+        <w:tc>
+          <w:tcPr>
+            <w:tcW w:type="dxa" w:w="7172"/>
+          </w:tcPr>
+          <w:p>
+            <w:r/>
+            <w:r>
+              <w:rPr>
+                <w:sz w:val="19"/>
+              </w:rPr>
+              <w:t xml:space="preserve">mã, phải có trong danh mục trangThai cùng phản hồi</w:t>
+            </w:r>
+          </w:p>
+        </w:tc>
+      </w:tr>
+      <w:tr>
+        <w:tc>
+          <w:tcPr>
+            <w:tcW w:type="dxa" w:w="2800"/>
+          </w:tcPr>
+          <w:p>
+            <w:r/>
+            <w:r>
+              <w:rPr>
+                <w:sz w:val="19"/>
+              </w:rPr>
+              <w:t xml:space="preserve">ds[].ngayTao, ngayCapNhat</w:t>
+            </w:r>
+          </w:p>
+        </w:tc>
+        <w:tc>
+          <w:tcPr>
+            <w:tcW w:type="dxa" w:w="7172"/>
+          </w:tcPr>
+          <w:p>
+            <w:r/>
+            <w:r>
+              <w:rPr>
+                <w:sz w:val="19"/>
+              </w:rPr>
+              <w:t xml:space="preserve">dd/MM/yyyy HH:mm, giờ Việt Nam</w:t>
+            </w:r>
+          </w:p>
+        </w:tc>
+      </w:tr>
+      <w:tr>
+        <w:tc>
+          <w:tcPr>
+            <w:tcW w:type="dxa" w:w="2800"/>
+          </w:tcPr>
+          <w:p>
+            <w:r/>
+            <w:r>
+              <w:rPr>
+                <w:sz w:val="19"/>
+              </w:rPr>
+              <w:t xml:space="preserve">ds[].soPhanHoiMoi</w:t>
+            </w:r>
+          </w:p>
+        </w:tc>
+        <w:tc>
+          <w:tcPr>
+            <w:tcW w:type="dxa" w:w="7172"/>
+          </w:tcPr>
+          <w:p>
+            <w:r/>
+            <w:r>
+              <w:rPr>
+                <w:sz w:val="19"/>
+              </w:rPr>
+              <w:t xml:space="preserve">số tin nhắn của nhân viên mà người dùng chưa đọc; 0 thì phần mềm không hiện gì</w:t>
+            </w:r>
+          </w:p>
+        </w:tc>
+      </w:tr>
+      <w:tr>
+        <w:tc>
+          <w:tcPr>
+            <w:tcW w:type="dxa" w:w="2800"/>
+          </w:tcPr>
+          <w:p>
+            <w:r/>
+            <w:r>
+              <w:rPr>
+                <w:sz w:val="19"/>
+              </w:rPr>
+              <w:t xml:space="preserve">ds[].nguoiPhuTrach, cuaToi</w:t>
+            </w:r>
+          </w:p>
+        </w:tc>
+        <w:tc>
+          <w:tcPr>
+            <w:tcW w:type="dxa" w:w="7172"/>
+          </w:tcPr>
+          <w:p>
+            <w:r/>
+            <w:r>
+              <w:rPr>
+                <w:sz w:val="19"/>
+              </w:rPr>
+              <w:t xml:space="preserve">tùy chọn; cuaToi = false khi phamVi = "truong" và yêu cầu do người khác tạo</w:t>
+            </w:r>
+          </w:p>
+        </w:tc>
+      </w:tr>
+    </w:tbl>
+    <w:p/>
+    <w:p>
+      <w:r>
+        <w:t xml:space="preserve">Trả về khi lỗi: HTTP 401 cho lỗi token, 400 cho tham số sai, 500 cho lỗi Help; thân luôn là JSON { "ok": false, "loi": "&lt;mã&gt;", "thongBao": "&lt;câu cho người dùng&gt;" }. Mã lỗi đề nghị: token-het-han, token-sai, truong-chua-dang-ky, tham-so-sai. Phần mềm hiện thongBao và nút "Thử lại" (phát token mới rồi gọi lại); không nhận được gì sau 10 giây cũng báo như vậy.</w:t>
+      </w:r>
+    </w:p>
+    <w:p>
+      <w:pPr>
+        <w:pStyle w:val="Heading2"/>
+      </w:pPr>
+      <w:r>
+        <w:t xml:space="preserve">10.3 Help phải bật thêm</w:t>
+      </w:r>
+    </w:p>
+    <w:p>
+      <w:pPr>
+        <w:pStyle w:val="ListBullet"/>
+      </w:pPr>
+      <w:r>
+        <w:t xml:space="preserve">CORS: phần mềm ở tên miền trường (qldt.&lt;trường&gt;.edu.vn), Help ở con98.api-apis.com, nên trình duyệt chặn nếu Help không trả Access-Control-Allow-Origin đúng tên miền gọi (danh sách tên miền đã đăng ký cho SSO, không dùng *), Access-Control-Allow-Methods: POST, Access-Control-Allow-Headers: Content-Type; trả 204 cho OPTIONS (preflight). KHÔNG cần Allow-Credentials.</w:t>
+      </w:r>
+    </w:p>
+    <w:p>
+      <w:pPr>
+        <w:pStyle w:val="ListBullet"/>
+      </w:pPr>
+      <w:r>
+        <w:t xml:space="preserve">Không đặt cookie, không dựa vào cookie ở cửa này: xác thực chỉ bằng token trong body. Nhờ vậy không dính chặn cookie bên thứ ba của Safari / Edge.</w:t>
+      </w:r>
+    </w:p>
+    <w:p>
+      <w:pPr>
+        <w:pStyle w:val="ListBullet"/>
+      </w:pPr>
+      <w:r>
+        <w:t xml:space="preserve">Thời gian trả ≤ 2 giây với 50 dòng. Phần mềm gọi tối đa vài lần mỗi phút cho một người (mở bảng, đổi bộ lọc); Help có thể giới hạn 30 lần / phút / người.</w:t>
+      </w:r>
+    </w:p>
+    <w:p>
+      <w:pPr>
+        <w:pStyle w:val="ListBullet"/>
+      </w:pPr>
+      <w:r>
+        <w:t xml:space="preserve">Token sống 60–120 giây và phát mới mỗi lần gọi, nên mỗi lần đổi bộ lọc là hai yêu cầu: một tới trang phát token của trường, một tới Help. Help muốn giảm thì có thể trả kèm "phienDanhSach" sống 10 phút để phần mềm gửi lại thay token ở các lần lọc tiếp — tùy chọn, không bắt buộc ở bản đầu.</w:t>
+      </w:r>
+    </w:p>
+    <w:p>
+      <w:pPr>
+        <w:pStyle w:val="Heading2"/>
+      </w:pPr>
+      <w:r>
+        <w:t xml:space="preserve">10.4 Sửa lại các mục trước cho khớp</w:t>
+      </w:r>
+    </w:p>
+    <w:tbl>
+      <w:tblPr>
+        <w:tblStyle w:val="TableGrid"/>
+        <w:tblW w:type="auto" w:w="0"/>
+        <w:tblLook w:firstColumn="1" w:firstRow="1" w:lastColumn="0" w:lastRow="0" w:noHBand="0" w:noVBand="1" w:val="04A0"/>
+      </w:tblPr>
+      <w:tblGrid>
+        <w:gridCol w:w="1700"/>
+        <w:gridCol w:w="3300"/>
+        <w:gridCol w:w="4972"/>
+      </w:tblGrid>
+      <w:tr>
+        <w:tc>
+          <w:tcPr>
+            <w:tcW w:type="dxa" w:w="1700"/>
+            <w:shd w:val="clear" w:color="auto" w:fill="EFF6FF"/>
+          </w:tcPr>
+          <w:p>
+            <w:r/>
+            <w:r>
+              <w:rPr>
+                <w:b/>
+                <w:sz w:val="19"/>
+              </w:rPr>
+              <w:t xml:space="preserve">Mục</w:t>
+            </w:r>
+          </w:p>
+        </w:tc>
+        <w:tc>
+          <w:tcPr>
+            <w:tcW w:type="dxa" w:w="3300"/>
+            <w:shd w:val="clear" w:color="auto" w:fill="EFF6FF"/>
+          </w:tcPr>
+          <w:p>
+            <w:r/>
+            <w:r>
+              <w:rPr>
+                <w:b/>
+                <w:sz w:val="19"/>
+              </w:rPr>
+              <w:t xml:space="preserve">Trước</w:t>
+            </w:r>
+          </w:p>
+        </w:tc>
+        <w:tc>
+          <w:tcPr>
+            <w:tcW w:type="dxa" w:w="4972"/>
+            <w:shd w:val="clear" w:color="auto" w:fill="EFF6FF"/>
+          </w:tcPr>
+          <w:p>
+            <w:r/>
+            <w:r>
+              <w:rPr>
+                <w:b/>
+                <w:sz w:val="19"/>
+              </w:rPr>
+              <w:t xml:space="preserve">Nay</w:t>
+            </w:r>
+          </w:p>
+        </w:tc>
+      </w:tr>
+      <w:tr>
+        <w:tc>
+          <w:tcPr>
+            <w:tcW w:type="dxa" w:w="1700"/>
+          </w:tcPr>
+          <w:p>
+            <w:r/>
+            <w:r>
+              <w:rPr>
+                <w:sz w:val="19"/>
+              </w:rPr>
+              <w:t xml:space="preserve">1. Mục đích</w:t>
+            </w:r>
+          </w:p>
+        </w:tc>
+        <w:tc>
+          <w:tcPr>
+            <w:tcW w:type="dxa" w:w="3300"/>
+          </w:tcPr>
+          <w:p>
+            <w:r/>
+            <w:r>
+              <w:rPr>
+                <w:sz w:val="19"/>
+              </w:rPr>
+              <w:t xml:space="preserve">Phần mềm chỉ làm hai việc: chụp ảnh và gửi một form</w:t>
+            </w:r>
+          </w:p>
+        </w:tc>
+        <w:tc>
+          <w:tcPr>
+            <w:tcW w:type="dxa" w:w="4972"/>
+          </w:tcPr>
+          <w:p>
+            <w:r/>
+            <w:r>
+              <w:rPr>
+                <w:sz w:val="19"/>
+              </w:rPr>
+              <w:t xml:space="preserve">Ba việc: xem danh sách yêu cầu của mình (10.2), chụp ảnh, gửi form</w:t>
+            </w:r>
+          </w:p>
+        </w:tc>
+      </w:tr>
+      <w:tr>
+        <w:tc>
+          <w:tcPr>
+            <w:tcW w:type="dxa" w:w="1700"/>
+          </w:tcPr>
+          <w:p>
+            <w:r/>
+            <w:r>
+              <w:rPr>
+                <w:sz w:val="19"/>
+              </w:rPr>
+              <w:t xml:space="preserve">2. Bước 1</w:t>
+            </w:r>
+          </w:p>
+        </w:tc>
+        <w:tc>
+          <w:tcPr>
+            <w:tcW w:type="dxa" w:w="3300"/>
+          </w:tcPr>
+          <w:p>
+            <w:r/>
+            <w:r>
+              <w:rPr>
+                <w:sz w:val="19"/>
+              </w:rPr>
+              <w:t xml:space="preserve">Bấm vào thì mở popup ở bước 2</w:t>
+            </w:r>
+          </w:p>
+        </w:tc>
+        <w:tc>
+          <w:tcPr>
+            <w:tcW w:type="dxa" w:w="4972"/>
+          </w:tcPr>
+          <w:p>
+            <w:r/>
+            <w:r>
+              <w:rPr>
+                <w:sz w:val="19"/>
+              </w:rPr>
+              <w:t xml:space="preserve">Bấm vào thì mở bảng "Yêu cầu của tôi" (10.1); nút "Tạo yêu cầu mới" trong bảng mới mở popup bước 2</w:t>
+            </w:r>
+          </w:p>
+        </w:tc>
+      </w:tr>
+      <w:tr>
+        <w:tc>
+          <w:tcPr>
+            <w:tcW w:type="dxa" w:w="1700"/>
+          </w:tcPr>
+          <w:p>
+            <w:r/>
+            <w:r>
+              <w:rPr>
+                <w:sz w:val="19"/>
+              </w:rPr>
+              <w:t xml:space="preserve">2. Bước 3a</w:t>
+            </w:r>
+          </w:p>
+        </w:tc>
+        <w:tc>
+          <w:tcPr>
+            <w:tcW w:type="dxa" w:w="3300"/>
+          </w:tcPr>
+          <w:p>
+            <w:r/>
+            <w:r>
+              <w:rPr>
+                <w:sz w:val="19"/>
+              </w:rPr>
+              <w:t xml:space="preserve">postMessage sau gửi nhanh</w:t>
+            </w:r>
+          </w:p>
+        </w:tc>
+        <w:tc>
+          <w:tcPr>
+            <w:tcW w:type="dxa" w:w="4972"/>
+          </w:tcPr>
+          <w:p>
+            <w:r/>
+            <w:r>
+              <w:rPr>
+                <w:sz w:val="19"/>
+              </w:rPr>
+              <w:t xml:space="preserve">Giữ nguyên nội dung, nhưng là BẮT BUỘC: phần mềm dùng id, url để chèn dòng mới vào bảng</w:t>
+            </w:r>
+          </w:p>
+        </w:tc>
+      </w:tr>
+      <w:tr>
+        <w:tc>
+          <w:tcPr>
+            <w:tcW w:type="dxa" w:w="1700"/>
+          </w:tcPr>
+          <w:p>
+            <w:r/>
+            <w:r>
+              <w:rPr>
+                <w:sz w:val="19"/>
+              </w:rPr>
+              <w:t xml:space="preserve">3. Ai làm gì</w:t>
+            </w:r>
+          </w:p>
+        </w:tc>
+        <w:tc>
+          <w:tcPr>
+            <w:tcW w:type="dxa" w:w="3300"/>
+          </w:tcPr>
+          <w:p>
+            <w:r/>
+            <w:r>
+              <w:rPr>
+                <w:sz w:val="19"/>
+              </w:rPr>
+              <w:t xml:space="preserve">—</w:t>
+            </w:r>
+          </w:p>
+        </w:tc>
+        <w:tc>
+          <w:tcPr>
+            <w:tcW w:type="dxa" w:w="4972"/>
+          </w:tcPr>
+          <w:p>
+            <w:r/>
+            <w:r>
+              <w:rPr>
+                <w:sz w:val="19"/>
+              </w:rPr>
+              <w:t xml:space="preserve">Thêm dòng: Bảng trượt, bộ lọc, gọi cửa danh sách = đội app ✔ · Cửa /ho-tro/danh-sach, CORS, danh mục trạng thái = Help ✔</w:t>
+            </w:r>
+          </w:p>
+        </w:tc>
+      </w:tr>
+      <w:tr>
+        <w:tc>
+          <w:tcPr>
+            <w:tcW w:type="dxa" w:w="1700"/>
+          </w:tcPr>
+          <w:p>
+            <w:r/>
+            <w:r>
+              <w:rPr>
+                <w:sz w:val="19"/>
+              </w:rPr>
+              <w:t xml:space="preserve">6. KHÔNG phải làm</w:t>
+            </w:r>
+          </w:p>
+        </w:tc>
+        <w:tc>
+          <w:tcPr>
+            <w:tcW w:type="dxa" w:w="3300"/>
+          </w:tcPr>
+          <w:p>
+            <w:r/>
+            <w:r>
+              <w:rPr>
+                <w:sz w:val="19"/>
+              </w:rPr>
+              <w:t xml:space="preserve">Không gọi API nào của Help</w:t>
+            </w:r>
+          </w:p>
+        </w:tc>
+        <w:tc>
+          <w:tcPr>
+            <w:tcW w:type="dxa" w:w="4972"/>
+          </w:tcPr>
+          <w:p>
+            <w:r/>
+            <w:r>
+              <w:rPr>
+                <w:sz w:val="19"/>
+              </w:rPr>
+              <w:t xml:space="preserve">Ngoại lệ duy nhất: cửa /ho-tro/danh-sach, chỉ gọi khi người dùng mở bảng hoặc đổi bộ lọc. "Không giữ token", "không cài SDK" vẫn đúng</w:t>
+            </w:r>
+          </w:p>
+        </w:tc>
+      </w:tr>
+      <w:tr>
+        <w:tc>
+          <w:tcPr>
+            <w:tcW w:type="dxa" w:w="1700"/>
+          </w:tcPr>
+          <w:p>
+            <w:r/>
+            <w:r>
+              <w:rPr>
+                <w:sz w:val="19"/>
+              </w:rPr>
+              <w:t xml:space="preserve">7. Thứ tự làm</w:t>
+            </w:r>
+          </w:p>
+        </w:tc>
+        <w:tc>
+          <w:tcPr>
+            <w:tcW w:type="dxa" w:w="3300"/>
+          </w:tcPr>
+          <w:p>
+            <w:r/>
+            <w:r>
+              <w:rPr>
+                <w:sz w:val="19"/>
+              </w:rPr>
+              <w:t xml:space="preserve">4 bước</w:t>
+            </w:r>
+          </w:p>
+        </w:tc>
+        <w:tc>
+          <w:tcPr>
+            <w:tcW w:type="dxa" w:w="4972"/>
+          </w:tcPr>
+          <w:p>
+            <w:r/>
+            <w:r>
+              <w:rPr>
+                <w:sz w:val="19"/>
+              </w:rPr>
+              <w:t xml:space="preserve">Thêm bước 5: Help lên cửa danh sách + CORS → phần mềm đổi nguồn bảng từ dữ liệu mẫu sang cửa thật, thử bộ lọc và phân trang bằng một tài khoản trường có ≥ 25 yêu cầu</w:t>
+            </w:r>
+          </w:p>
+        </w:tc>
+      </w:tr>
+    </w:tbl>
+    <w:p/>
+    <w:p>
+      <w:pPr>
+        <w:pStyle w:val="Heading2"/>
+      </w:pPr>
+      <w:r>
+        <w:t xml:space="preserve">10.5 Phía app làm ngay, không chờ Help</w:t>
+      </w:r>
+    </w:p>
+    <w:p>
+      <w:pPr>
+        <w:pStyle w:val="ListBullet"/>
+      </w:pPr>
+      <w:r>
+        <w:t xml:space="preserve">Dựng bảng trượt, bộ lọc, danh sách và nút "Tạo yêu cầu mới" trong plugin hiện có (_v2/assets/plugin/btn-yeucau-hotro), chạy bằng dữ liệu mẫu đúng hình dạng JSON ở 10.2.</w:t>
+      </w:r>
+    </w:p>
+    <w:p>
+      <w:pPr>
+        <w:pStyle w:val="ListBullet"/>
+      </w:pPr>
+      <w:r>
+        <w:t xml:space="preserve">Nguồn dữ liệu gói trong một hàm; Help lên cửa thật thì đổi đúng một địa chỉ cấu hình, không sửa giao diện.</w:t>
+      </w:r>
+    </w:p>
+    <w:p>
+      <w:pPr>
+        <w:pStyle w:val="ListBullet"/>
+      </w:pPr>
+      <w:r>
+        <w:t xml:space="preserve">Sửa "Gửi nhanh" về đúng bước 3a (iframe ẩn + nhận postMessage) để có id chèn vào bảng; hiện bản đầu đang mở tab cho cả hai nút.</w:t>
+      </w:r>
+    </w:p>
+    <w:p>
+      <w:pPr>
+        <w:pStyle w:val="Heading2"/>
+      </w:pPr>
+      <w:r>
+        <w:t xml:space="preserve">10.6 Câu hỏi với Help — cần trả lời trước khi phần mềm nối cửa thật</w:t>
+      </w:r>
+    </w:p>
+    <w:tbl>
+      <w:tblPr>
+        <w:tblStyle w:val="TableGrid"/>
+        <w:tblW w:type="auto" w:w="0"/>
+        <w:tblLook w:firstColumn="1" w:firstRow="1" w:lastColumn="0" w:lastRow="0" w:noHBand="0" w:noVBand="1" w:val="04A0"/>
+      </w:tblPr>
+      <w:tblGrid>
+        <w:gridCol w:w="4300"/>
+        <w:gridCol w:w="5672"/>
+      </w:tblGrid>
+      <w:tr>
+        <w:tc>
+          <w:tcPr>
+            <w:tcW w:type="dxa" w:w="4300"/>
+            <w:shd w:val="clear" w:color="auto" w:fill="EFF6FF"/>
+          </w:tcPr>
+          <w:p>
+            <w:r/>
+            <w:r>
+              <w:rPr>
+                <w:b/>
+                <w:sz w:val="19"/>
+              </w:rPr>
+              <w:t xml:space="preserve">Câu hỏi</w:t>
+            </w:r>
+          </w:p>
+        </w:tc>
+        <w:tc>
+          <w:tcPr>
+            <w:tcW w:type="dxa" w:w="5672"/>
+            <w:shd w:val="clear" w:color="auto" w:fill="EFF6FF"/>
+          </w:tcPr>
+          <w:p>
+            <w:r/>
+            <w:r>
+              <w:rPr>
+                <w:b/>
+                <w:sz w:val="19"/>
+              </w:rPr>
+              <w:t xml:space="preserve">Đội app đề nghị</w:t>
+            </w:r>
+          </w:p>
+        </w:tc>
+      </w:tr>
+      <w:tr>
+        <w:tc>
+          <w:tcPr>
+            <w:tcW w:type="dxa" w:w="4300"/>
+          </w:tcPr>
+          <w:p>
+            <w:r/>
+            <w:r>
+              <w:rPr>
+                <w:sz w:val="19"/>
+              </w:rPr>
+              <w:t xml:space="preserve">Bộ trạng thái hiện có của Help gồm những mã nào, tên và màu?</w:t>
+            </w:r>
+          </w:p>
+        </w:tc>
+        <w:tc>
+          <w:tcPr>
+            <w:tcW w:type="dxa" w:w="5672"/>
+          </w:tcPr>
+          <w:p>
+            <w:r/>
+            <w:r>
+              <w:rPr>
+                <w:sz w:val="19"/>
+              </w:rPr>
+              <w:t xml:space="preserve">Trả thẳng trong danh mục trangThai của 10.2; phần mềm không ghim cứng mã nào</w:t>
+            </w:r>
+          </w:p>
+        </w:tc>
+      </w:tr>
+      <w:tr>
+        <w:tc>
+          <w:tcPr>
+            <w:tcW w:type="dxa" w:w="4300"/>
+          </w:tcPr>
+          <w:p>
+            <w:r/>
+            <w:r>
+              <w:rPr>
+                <w:sz w:val="19"/>
+              </w:rPr>
+              <w:t xml:space="preserve">Có cho người dùng xem yêu cầu của người khác cùng trường (phamVi = "truong") không?</w:t>
+            </w:r>
+          </w:p>
+        </w:tc>
+        <w:tc>
+          <w:tcPr>
+            <w:tcW w:type="dxa" w:w="5672"/>
+          </w:tcPr>
+          <w:p>
+            <w:r/>
+            <w:r>
+              <w:rPr>
+                <w:sz w:val="19"/>
+              </w:rPr>
+              <w:t xml:space="preserve">Có, vì bước 2 đã nhắc "người cùng ứng dụng ở trường bạn sẽ nhìn thấy"; nếu Help từ chối, trả rỗng và phần mềm ẩn công tắc</w:t>
+            </w:r>
+          </w:p>
+        </w:tc>
+      </w:tr>
+      <w:tr>
+        <w:tc>
+          <w:tcPr>
+            <w:tcW w:type="dxa" w:w="4300"/>
+          </w:tcPr>
+          <w:p>
+            <w:r/>
+            <w:r>
+              <w:rPr>
+                <w:sz w:val="19"/>
+              </w:rPr>
+              <w:t xml:space="preserve">Danh sách tên miền trường để bật CORS lấy ở đâu?</w:t>
+            </w:r>
+          </w:p>
+        </w:tc>
+        <w:tc>
+          <w:tcPr>
+            <w:tcW w:type="dxa" w:w="5672"/>
+          </w:tcPr>
+          <w:p>
+            <w:r/>
+            <w:r>
+              <w:rPr>
+                <w:sz w:val="19"/>
+              </w:rPr>
+              <w:t xml:space="preserve">Dùng đúng danh sách tên miền đã đăng ký cho SSO; đội app gửi bổ sung khi có trường mới</w:t>
+            </w:r>
+          </w:p>
+        </w:tc>
+      </w:tr>
+      <w:tr>
+        <w:tc>
+          <w:tcPr>
+            <w:tcW w:type="dxa" w:w="4300"/>
+          </w:tcPr>
+          <w:p>
+            <w:r/>
+            <w:r>
+              <w:rPr>
+                <w:sz w:val="19"/>
+              </w:rPr>
+              <w:t xml:space="preserve">Khi nào cửa danh sách lên máy chủ?</w:t>
+            </w:r>
+          </w:p>
+        </w:tc>
+        <w:tc>
+          <w:tcPr>
+            <w:tcW w:type="dxa" w:w="5672"/>
+          </w:tcPr>
+          <w:p>
+            <w:r/>
+            <w:r>
+              <w:rPr>
+                <w:sz w:val="19"/>
+              </w:rPr>
+              <w:t xml:space="preserve">Phần mềm chạy dữ liệu mẫu tới lúc đó; xin báo ngày để xếp lịch thử đầu-cuối (bước 5 ở 10.4)</w:t>
+            </w:r>
+          </w:p>
+        </w:tc>
+      </w:tr>
+    </w:tbl>
+    <w:p/>
+    <w:p>
+      <w:pPr>
+        <w:pStyle w:val="Heading1"/>
+      </w:pPr>
+      <w:r>
+        <w:t>10.7 Help trả lời mục 10 (26/10/2026)</w:t>
+      </w:r>
+    </w:p>
+    <w:p>
+      <w:r>
+        <w:t>Help đã dựng xong cửa danh sách trên máy dev đúng mục 10, lên máy chủ ở đợt cập nhật kế tiếp (Help báo ngày). Dưới đây là chỗ khớp và ba chỗ lệch so với ví dụ ở 10.2; chi tiết kỹ thuật đầy đủ ở tệp yeu-cau-ho-tro-cho-doi-app.md mục 10 phía Help.</w:t>
+      </w:r>
+    </w:p>
+    <w:p>
+      <w:pPr>
+        <w:pStyle w:val="Heading2"/>
+      </w:pPr>
+      <w:r>
+        <w:t>Khớp tài liệu</w:t>
+      </w:r>
+    </w:p>
+    <w:p>
+      <w:pPr>
+        <w:pStyle w:val="ListBullet"/>
+      </w:pPr>
+      <w:r>
+        <w:t>Địa chỉ OPTIONS / POST https://con98.api-apis.com/help-master/ho-tro/danh-sach; thân form-urlencoded hoặc JSON; token trong thân, phát mới mỗi lần; không cookie, không phiên.</w:t>
+      </w:r>
+    </w:p>
+    <w:p>
+      <w:pPr>
+        <w:pStyle w:val="ListBullet"/>
+      </w:pPr>
+      <w:r>
+        <w:t>Tham số: token, v, phamVi (toi | truong), ma, trangThai (nhiều mã cách dấu phẩy), tuKhoa, tuNgay / denNgay (dd/MM/yyyy giờ VN, lọc theo ngày cập nhật), trang, kichCo (≤ 50). Sắp theo ngày cập nhật giảm dần.</w:t>
+      </w:r>
+    </w:p>
+    <w:p>
+      <w:pPr>
+        <w:pStyle w:val="ListBullet"/>
+      </w:pPr>
+      <w:r>
+        <w:t>CORS tự động: Help trả Access-Control-Allow-Origin đúng tên miền gọi nếu tên miền đó là của một trường đã khai trong sổ trường của Help (cùng danh sách dùng cho SSO). Không dùng *, không Allow-Credentials, preflight 204. Trường mới khai xong là gọi được — không cần gửi danh sách tên miền.</w:t>
+      </w:r>
+    </w:p>
+    <w:p>
+      <w:pPr>
+        <w:pStyle w:val="ListBullet"/>
+      </w:pPr>
+      <w:r>
+        <w:t>Lỗi: 401 { ok:false, loi: token-het-han | token-sai | truong-chua-dang-ky, thongBao }, 400 { loi: tham-so-sai }, 500 { loi: loi-he-thong }. Giới hạn 30 lần / phút mỗi nguồn gọi.</w:t>
+      </w:r>
+    </w:p>
+    <w:p>
+      <w:pPr>
+        <w:pStyle w:val="ListBullet"/>
+      </w:pPr>
+      <w:r>
+        <w:t>phamVi = "truong": CÓ — trả yêu cầu của người cùng trường ở các màn thuộc ứng dụng người gọi được cấp trên Help, cộng kênh "Chung" của trường; cuaToi = false với yêu cầu người khác tạo.</w:t>
+      </w:r>
+    </w:p>
+    <w:p>
+      <w:pPr>
+        <w:pStyle w:val="ListBullet"/>
+      </w:pPr>
+      <w:r>
+        <w:t>postMessage sau Gửi nhanh ({ loai: "help-ho-tro-xong", ok, id, url, soTuongTu }) đã có sẵn từ bản 0.4 — phần mềm dùng id, url để chèn dòng mới như 10.1.</w:t>
+      </w:r>
+    </w:p>
+    <w:p>
+      <w:pPr>
+        <w:pStyle w:val="Heading2"/>
+      </w:pPr>
+      <w:r>
+        <w:t>Ba chỗ lệch so với ví dụ JSON ở 10.2</w:t>
+      </w:r>
+    </w:p>
+    <w:tbl>
+      <w:tblPr>
+        <w:tblStyle w:val="TableGrid"/>
+        <w:tblW w:type="auto" w:w="0"/>
+        <w:tblLook w:firstColumn="1" w:firstRow="1" w:lastColumn="0" w:lastRow="0" w:noHBand="0" w:noVBand="1" w:val="04A0"/>
+      </w:tblPr>
+      <w:tblGrid>
+        <w:gridCol w:w="2493"/>
+        <w:gridCol w:w="2493"/>
+        <w:gridCol w:w="2493"/>
+        <w:gridCol w:w="2493"/>
+      </w:tblGrid>
+      <w:tr>
+        <w:tc>
+          <w:tcPr>
+            <w:tcW w:type="dxa" w:w="2493"/>
+            <w:shd w:val="clear" w:color="auto" w:fill="EFF6FF"/>
+          </w:tcPr>
+          <w:p>
+            <w:r/>
+            <w:r>
+              <w:rPr>
+                <w:b/>
+                <w:sz w:val="19"/>
+              </w:rPr>
+              <w:t>Trường</w:t>
+            </w:r>
+          </w:p>
+        </w:tc>
+        <w:tc>
+          <w:tcPr>
+            <w:tcW w:type="dxa" w:w="2493"/>
+            <w:shd w:val="clear" w:color="auto" w:fill="EFF6FF"/>
+          </w:tcPr>
+          <w:p>
+            <w:r/>
+            <w:r>
+              <w:rPr>
+                <w:b/>
+                <w:sz w:val="19"/>
+              </w:rPr>
+              <w:t>Ví dụ ở 10.2</w:t>
+            </w:r>
+          </w:p>
+        </w:tc>
+        <w:tc>
+          <w:tcPr>
+            <w:tcW w:type="dxa" w:w="2493"/>
+            <w:shd w:val="clear" w:color="auto" w:fill="EFF6FF"/>
+          </w:tcPr>
+          <w:p>
+            <w:r/>
+            <w:r>
+              <w:rPr>
+                <w:b/>
+                <w:sz w:val="19"/>
+              </w:rPr>
+              <w:t>Help trả</w:t>
+            </w:r>
+          </w:p>
+        </w:tc>
+        <w:tc>
+          <w:tcPr>
+            <w:tcW w:type="dxa" w:w="2493"/>
+            <w:shd w:val="clear" w:color="auto" w:fill="EFF6FF"/>
+          </w:tcPr>
+          <w:p>
+            <w:r/>
+            <w:r>
+              <w:rPr>
+                <w:b/>
+                <w:sz w:val="19"/>
+              </w:rPr>
+              <w:t>Vì sao</w:t>
+            </w:r>
+          </w:p>
+        </w:tc>
+      </w:tr>
+      <w:tr>
+        <w:tc>
+          <w:tcPr>
+            <w:tcW w:type="dxa" w:w="2493"/>
+          </w:tcPr>
+          <w:p>
+            <w:r/>
+            <w:r>
+              <w:rPr>
+                <w:sz w:val="19"/>
+              </w:rPr>
+              <w:t>id</w:t>
+            </w:r>
+          </w:p>
+        </w:tc>
+        <w:tc>
+          <w:tcPr>
+            <w:tcW w:type="dxa" w:w="2493"/>
+          </w:tcPr>
+          <w:p>
+            <w:r/>
+            <w:r>
+              <w:rPr>
+                <w:sz w:val="19"/>
+              </w:rPr>
+              <w:t>HT-2026-01234</w:t>
+            </w:r>
+          </w:p>
+        </w:tc>
+        <w:tc>
+          <w:tcPr>
+            <w:tcW w:type="dxa" w:w="2493"/>
+          </w:tcPr>
+          <w:p>
+            <w:r/>
+            <w:r>
+              <w:rPr>
+                <w:sz w:val="19"/>
+              </w:rPr>
+              <w:t>id = uuid (dùng trong url); thêm maHienThi = "HT-124" để hiện cho người dùng</w:t>
+            </w:r>
+          </w:p>
+        </w:tc>
+        <w:tc>
+          <w:tcPr>
+            <w:tcW w:type="dxa" w:w="2493"/>
+          </w:tcPr>
+          <w:p>
+            <w:r/>
+            <w:r>
+              <w:rPr>
+                <w:sz w:val="19"/>
+              </w:rPr>
+              <w:t>uuid là khóa thật của Help; số hiển thị là cột tăng dần</w:t>
+            </w:r>
+          </w:p>
+        </w:tc>
+      </w:tr>
+      <w:tr>
+        <w:tc>
+          <w:tcPr>
+            <w:tcW w:type="dxa" w:w="2493"/>
+          </w:tcPr>
+          <w:p>
+            <w:r/>
+            <w:r>
+              <w:rPr>
+                <w:sz w:val="19"/>
+              </w:rPr>
+              <w:t>trangThai.ma</w:t>
+            </w:r>
+          </w:p>
+        </w:tc>
+        <w:tc>
+          <w:tcPr>
+            <w:tcW w:type="dxa" w:w="2493"/>
+          </w:tcPr>
+          <w:p>
+            <w:r/>
+            <w:r>
+              <w:rPr>
+                <w:sz w:val="19"/>
+              </w:rPr>
+              <w:t>moi, dang-xu-ly…</w:t>
+            </w:r>
+          </w:p>
+        </w:tc>
+        <w:tc>
+          <w:tcPr>
+            <w:tcW w:type="dxa" w:w="2493"/>
+          </w:tcPr>
+          <w:p>
+            <w:r/>
+            <w:r>
+              <w:rPr>
+                <w:sz w:val="19"/>
+              </w:rPr>
+              <w:t>MOI, DANG_XU_LY, CHO_NGUOI_DUNG, DA_XU_LY, DA_DONG (tên + màu hex kèm trong mọi phản hồi)</w:t>
+            </w:r>
+          </w:p>
+        </w:tc>
+        <w:tc>
+          <w:tcPr>
+            <w:tcW w:type="dxa" w:w="2493"/>
+          </w:tcPr>
+          <w:p>
+            <w:r/>
+            <w:r>
+              <w:rPr>
+                <w:sz w:val="19"/>
+              </w:rPr>
+              <w:t>đúng mã Help đang dùng; phần mềm lấy từ danh mục nên không ảnh hưởng</w:t>
+            </w:r>
+          </w:p>
+        </w:tc>
+      </w:tr>
+      <w:tr>
+        <w:tc>
+          <w:tcPr>
+            <w:tcW w:type="dxa" w:w="2493"/>
+          </w:tcPr>
+          <w:p>
+            <w:r/>
+            <w:r>
+              <w:rPr>
+                <w:sz w:val="19"/>
+              </w:rPr>
+              <w:t>ds[].ma</w:t>
+            </w:r>
+          </w:p>
+        </w:tc>
+        <w:tc>
+          <w:tcPr>
+            <w:tcW w:type="dxa" w:w="2493"/>
+          </w:tcPr>
+          <w:p>
+            <w:r/>
+            <w:r>
+              <w:rPr>
+                <w:sz w:val="19"/>
+              </w:rPr>
+              <w:t>CHUCNANG.ID</w:t>
+            </w:r>
+          </w:p>
+        </w:tc>
+        <w:tc>
+          <w:tcPr>
+            <w:tcW w:type="dxa" w:w="2493"/>
+          </w:tcPr>
+          <w:p>
+            <w:r/>
+            <w:r>
+              <w:rPr>
+                <w:sz w:val="19"/>
+              </w:rPr>
+              <w:t>mã nghiệp vụ (MACHUCNANG) của màn, null nếu không có</w:t>
+            </w:r>
+          </w:p>
+        </w:tc>
+        <w:tc>
+          <w:tcPr>
+            <w:tcW w:type="dxa" w:w="2493"/>
+          </w:tcPr>
+          <w:p>
+            <w:r/>
+            <w:r>
+              <w:rPr>
+                <w:sz w:val="19"/>
+              </w:rPr>
+              <w:t>để hiện; LỌC thì gửi ma = CHUCNANG.ID hoặc mã nghiệp vụ đều được</w:t>
+            </w:r>
+          </w:p>
+        </w:tc>
+      </w:tr>
+    </w:tbl>
+    <w:p/>
+    <w:p>
+      <w:r>
+        <w:t>soPhanHoiMoi = số tin của nhân viên hỗ trợ mà người này chưa mở xem trên Help (Help ghi nhận "đã đọc" khi họ mở trang vấn đề). phienDanhSach (token sống 10 phút) chưa làm — bản đầu phát token mới mỗi lần như 10.3 nói.</w:t>
+      </w:r>
+    </w:p>
+    <w:p>
+      <w:pPr>
+        <w:pStyle w:val="Heading2"/>
+      </w:pPr>
+      <w:r>
+        <w:t>Trả lời 10.6</w:t>
+      </w:r>
+    </w:p>
+    <w:tbl>
+      <w:tblPr>
+        <w:tblStyle w:val="TableGrid"/>
+        <w:tblW w:type="auto" w:w="0"/>
+        <w:tblLook w:firstColumn="1" w:firstRow="1" w:lastColumn="0" w:lastRow="0" w:noHBand="0" w:noVBand="1" w:val="04A0"/>
+      </w:tblPr>
+      <w:tblGrid>
+        <w:gridCol w:w="4986"/>
+        <w:gridCol w:w="4986"/>
+      </w:tblGrid>
+      <w:tr>
+        <w:tc>
+          <w:tcPr>
+            <w:tcW w:type="dxa" w:w="4986"/>
+            <w:shd w:val="clear" w:color="auto" w:fill="EFF6FF"/>
+          </w:tcPr>
+          <w:p>
+            <w:r/>
+            <w:r>
+              <w:rPr>
+                <w:b/>
+                <w:sz w:val="19"/>
+              </w:rPr>
+              <w:t>Câu hỏi</w:t>
+            </w:r>
+          </w:p>
+        </w:tc>
+        <w:tc>
+          <w:tcPr>
+            <w:tcW w:type="dxa" w:w="4986"/>
+            <w:shd w:val="clear" w:color="auto" w:fill="EFF6FF"/>
+          </w:tcPr>
+          <w:p>
+            <w:r/>
+            <w:r>
+              <w:rPr>
+                <w:b/>
+                <w:sz w:val="19"/>
+              </w:rPr>
+              <w:t>Trả lời</w:t>
+            </w:r>
+          </w:p>
+        </w:tc>
+      </w:tr>
+      <w:tr>
+        <w:tc>
+          <w:tcPr>
+            <w:tcW w:type="dxa" w:w="4986"/>
+          </w:tcPr>
+          <w:p>
+            <w:r/>
+            <w:r>
+              <w:rPr>
+                <w:sz w:val="19"/>
+              </w:rPr>
+              <w:t>Bộ trạng thái hiện có</w:t>
+            </w:r>
+          </w:p>
+        </w:tc>
+        <w:tc>
+          <w:tcPr>
+            <w:tcW w:type="dxa" w:w="4986"/>
+          </w:tcPr>
+          <w:p>
+            <w:r/>
+            <w:r>
+              <w:rPr>
+                <w:sz w:val="19"/>
+              </w:rPr>
+              <w:t>5 mã ở bảng trên, luôn kèm trong mọi phản hồi, thứ tự trả = thứ tự hiện</w:t>
+            </w:r>
+          </w:p>
+        </w:tc>
+      </w:tr>
+      <w:tr>
+        <w:tc>
+          <w:tcPr>
+            <w:tcW w:type="dxa" w:w="4986"/>
+          </w:tcPr>
+          <w:p>
+            <w:r/>
+            <w:r>
+              <w:rPr>
+                <w:sz w:val="19"/>
+              </w:rPr>
+              <w:t>phamVi = "truong"</w:t>
+            </w:r>
+          </w:p>
+        </w:tc>
+        <w:tc>
+          <w:tcPr>
+            <w:tcW w:type="dxa" w:w="4986"/>
+          </w:tcPr>
+          <w:p>
+            <w:r/>
+            <w:r>
+              <w:rPr>
+                <w:sz w:val="19"/>
+              </w:rPr>
+              <w:t>Có, theo đúng quyền Help đang áp (ứng dụng được cấp + kênh Chung)</w:t>
+            </w:r>
+          </w:p>
+        </w:tc>
+      </w:tr>
+      <w:tr>
+        <w:tc>
+          <w:tcPr>
+            <w:tcW w:type="dxa" w:w="4986"/>
+          </w:tcPr>
+          <w:p>
+            <w:r/>
+            <w:r>
+              <w:rPr>
+                <w:sz w:val="19"/>
+              </w:rPr>
+              <w:t>Danh sách tên miền CORS</w:t>
+            </w:r>
+          </w:p>
+        </w:tc>
+        <w:tc>
+          <w:tcPr>
+            <w:tcW w:type="dxa" w:w="4986"/>
+          </w:tcPr>
+          <w:p>
+            <w:r/>
+            <w:r>
+              <w:rPr>
+                <w:sz w:val="19"/>
+              </w:rPr>
+              <w:t>Tự lấy từ sổ trường trên Help, không cần gửi</w:t>
+            </w:r>
+          </w:p>
+        </w:tc>
+      </w:tr>
+      <w:tr>
+        <w:tc>
+          <w:tcPr>
+            <w:tcW w:type="dxa" w:w="4986"/>
+          </w:tcPr>
+          <w:p>
+            <w:r/>
+            <w:r>
+              <w:rPr>
+                <w:sz w:val="19"/>
+              </w:rPr>
+              <w:t>Khi nào lên máy chủ</w:t>
+            </w:r>
+          </w:p>
+        </w:tc>
+        <w:tc>
+          <w:tcPr>
+            <w:tcW w:type="dxa" w:w="4986"/>
+          </w:tcPr>
+          <w:p>
+            <w:r/>
+            <w:r>
+              <w:rPr>
+                <w:sz w:val="19"/>
+              </w:rPr>
+              <w:t>Máy dev đã có (26/10/2026); lên máy chủ ở đợt cập nhật kế tiếp, Help báo ngày để xếp lịch thử bước 5</w:t>
+            </w:r>
+          </w:p>
+        </w:tc>
+      </w:tr>
+    </w:tbl>
+    <w:p/>
     <w:sectPr>
       <w:pgSz w:w="12240" w:h="15840"/>
       <w:pgMar w:top="1020" w:right="1134" w:bottom="1020" w:left="1134" w:header="720" w:footer="720" w:gutter="0"/>

</xml_diff>

<commit_message>
Tài liệu nút Yêu cầu hỗ trợ: mục 11 đề xuất để bàn với Help — làm việc với yêu cầu ngay trong popup (nhúng trang vấn đề, token phiên không cookie, frame-ancestors, bộ sự kiện postMessage, lối lui), bỏ chuyển tab
Co-Authored-By: Claude Fable 5.1 <noreply@anthropic.com>
</commit_message>
<xml_diff>
--- a/nut-yeu-cau-ho-tro-tren-app.docx
+++ b/nut-yeu-cau-ho-tro-tren-app.docx
@@ -3921,6 +3921,1153 @@
       </w:tr>
     </w:tbl>
     <w:p/>
+    <w:p>
+      <w:pPr>
+        <w:pStyle w:val="Heading1"/>
+      </w:pPr>
+      <w:r>
+        <w:t xml:space="preserve">11. Đề xuất 26/10/2026 (đội app → Help, ĐỂ BÀN): làm việc với yêu cầu ngay trong popup, bỏ chuyển tab</w:t>
+      </w:r>
+    </w:p>
+    <w:tbl>
+      <w:tblPr>
+        <w:tblW w:type="auto" w:w="0"/>
+        <w:tblLook w:firstColumn="1" w:firstRow="1" w:lastColumn="0" w:lastRow="0" w:noHBand="0" w:noVBand="1" w:val="04A0"/>
+      </w:tblPr>
+      <w:tblGrid>
+        <w:gridCol w:w="9972"/>
+      </w:tblGrid>
+      <w:tr>
+        <w:tc>
+          <w:tcPr>
+            <w:tcW w:type="dxa" w:w="9972"/>
+            <w:shd w:val="clear" w:color="auto" w:fill="FFFBEB"/>
+          </w:tcPr>
+          <w:p>
+            <w:r>
+              <w:rPr>
+                <w:sz w:val="19"/>
+              </w:rPr>
+              <w:t xml:space="preserve">Mục này là ĐỀ XUẤT để bàn lại, chưa chốt. Nếu Help đồng ý thì nó thay bước 3a / 3b / 4 và phần "bấm dòng → mở url ở tab" của 10.1; mục 10.2 (cửa danh sách) và 10.3 giữ nguyên. Nếu Help không làm được trong đợt này thì giữ nguyên mục 10, không làm nửa vời.</w:t>
+            </w:r>
+          </w:p>
+        </w:tc>
+      </w:tr>
+    </w:tbl>
+    <w:p/>
+    <w:p>
+      <w:r>
+        <w:t xml:space="preserve">Lý do: sau khi gửi, người dùng hiện phải sang tab Help để theo dõi và trao đổi (trang vấn đề ở bước 4). Chủ dự án muốn người dùng ở lại màn đang làm: gửi xong thấy ngay khung trao đổi với hỗ trợ trong popup, mở lại yêu cầu cũ từ bảng cũng trao đổi ngay tại chỗ. Không mở tab, không chuyển url. Cách rẻ nhất là NHÚNG trang vấn đề Help đã có (khung chat, trạng thái, đính kèm, đã đọc) vào một iframe trong popup, thay vì app dựng lại khung chat và Help mở thêm bốn, năm cửa API.</w:t>
+      </w:r>
+    </w:p>
+    <w:p>
+      <w:pPr>
+        <w:pStyle w:val="Heading2"/>
+      </w:pPr>
+      <w:r>
+        <w:t xml:space="preserve">11.1 Luồng đề xuất</w:t>
+      </w:r>
+    </w:p>
+    <w:p>
+      <w:pPr>
+        <w:pStyle w:val="ListBullet"/>
+      </w:pPr>
+      <w:r>
+        <w:t xml:space="preserve">Popup bước 2 chỉ còn MỘT nút "Gửi" (bỏ "Chi tiết hơn"). Gửi xong, vùng ảnh và ô mô tả thu lại, chỗ đó hiện iframe trang vấn đề nhúng của Help: người dùng trao đổi, dán ảnh, xem trạng thái ngay trong popup. Tiêu đề, mức ưu tiên, ảnh thêm: bổ sung trong khung chat (xem câu hỏi 11.6).</w:t>
+      </w:r>
+    </w:p>
+    <w:p>
+      <w:pPr>
+        <w:pStyle w:val="ListBullet"/>
+      </w:pPr>
+      <w:r>
+        <w:t xml:space="preserve">Bấm một dòng trong bảng "Yêu cầu của tôi" → mở popup với iframe của yêu cầu đó (app POST token + id vào iframe, cùng cơ chế gửi nhanh). Không mở tab help-portal, không gửi url đi đâu; tab đó chỉ còn ở nút "?" và ở lối lui bên dưới.</w:t>
+      </w:r>
+    </w:p>
+    <w:p>
+      <w:pPr>
+        <w:pStyle w:val="ListBullet"/>
+      </w:pPr>
+      <w:r>
+        <w:t xml:space="preserve">Form gửi vẫn là form ở mục 4, target vào iframe đang HIỆN (không ẩn nữa), cheDo = "nhung". Help tạo yêu cầu rồi trả THẲNG trang vấn đề nhúng trong iframe đó, kèm postMessage "đã tạo" như bước 3a. Cơ chế iframe + postMessage đã làm ở 10.1 giữ nguyên.</w:t>
+      </w:r>
+    </w:p>
+    <w:p>
+      <w:pPr>
+        <w:pStyle w:val="ListBullet"/>
+      </w:pPr>
+      <w:r>
+        <w:t xml:space="preserve">Lối lui bắt buộc: iframe không báo "sẵn sàng" sau 10 giây (trình duyệt chặn khung, chặn lưu trữ, Help lỗi) → popup hiện nút "Mở trong Help" mở tab help-portal như cũ. Không ai bị kẹt.</w:t>
+      </w:r>
+    </w:p>
+    <w:p>
+      <w:pPr>
+        <w:pStyle w:val="Heading2"/>
+      </w:pPr>
+      <w:r>
+        <w:t xml:space="preserve">11.2 Help cần làm</w:t>
+      </w:r>
+    </w:p>
+    <w:tbl>
+      <w:tblPr>
+        <w:tblStyle w:val="TableGrid"/>
+        <w:tblW w:type="auto" w:w="0"/>
+        <w:tblLook w:firstColumn="1" w:firstRow="1" w:lastColumn="0" w:lastRow="0" w:noHBand="0" w:noVBand="1" w:val="04A0"/>
+      </w:tblPr>
+      <w:tblGrid>
+        <w:gridCol w:w="2600"/>
+        <w:gridCol w:w="5372"/>
+        <w:gridCol w:w="2000"/>
+      </w:tblGrid>
+      <w:tr>
+        <w:tc>
+          <w:tcPr>
+            <w:tcW w:type="dxa" w:w="2600"/>
+            <w:shd w:val="clear" w:color="auto" w:fill="EFF6FF"/>
+          </w:tcPr>
+          <w:p>
+            <w:r/>
+            <w:r>
+              <w:rPr>
+                <w:b/>
+                <w:sz w:val="19"/>
+              </w:rPr>
+              <w:t xml:space="preserve">Việc</w:t>
+            </w:r>
+          </w:p>
+        </w:tc>
+        <w:tc>
+          <w:tcPr>
+            <w:tcW w:type="dxa" w:w="5372"/>
+            <w:shd w:val="clear" w:color="auto" w:fill="EFF6FF"/>
+          </w:tcPr>
+          <w:p>
+            <w:r/>
+            <w:r>
+              <w:rPr>
+                <w:b/>
+                <w:sz w:val="19"/>
+              </w:rPr>
+              <w:t xml:space="preserve">Chi tiết</w:t>
+            </w:r>
+          </w:p>
+        </w:tc>
+        <w:tc>
+          <w:tcPr>
+            <w:tcW w:type="dxa" w:w="2000"/>
+            <w:shd w:val="clear" w:color="auto" w:fill="EFF6FF"/>
+          </w:tcPr>
+          <w:p>
+            <w:r/>
+            <w:r>
+              <w:rPr>
+                <w:b/>
+                <w:sz w:val="19"/>
+              </w:rPr>
+              <w:t xml:space="preserve">Vì sao</w:t>
+            </w:r>
+          </w:p>
+        </w:tc>
+      </w:tr>
+      <w:tr>
+        <w:tc>
+          <w:tcPr>
+            <w:tcW w:type="dxa" w:w="2600"/>
+          </w:tcPr>
+          <w:p>
+            <w:r/>
+            <w:r>
+              <w:rPr>
+                <w:sz w:val="19"/>
+              </w:rPr>
+              <w:t xml:space="preserve">1. Chế độ nhúng cho trang vấn đề</w:t>
+            </w:r>
+          </w:p>
+        </w:tc>
+        <w:tc>
+          <w:tcPr>
+            <w:tcW w:type="dxa" w:w="5372"/>
+          </w:tcPr>
+          <w:p>
+            <w:r/>
+            <w:r>
+              <w:rPr>
+                <w:sz w:val="19"/>
+              </w:rPr>
+              <w:t xml:space="preserve">Địa chỉ dạng /ho-tro/van-de/&lt;id&gt;?nhung=1, nhận POST token (+ v) như cửa gửi. Ẩn thanh đầu, nút quay lại, menu, chân trang; chỉ còn khung trao đổi, nhãn trạng thái, nút (i) thông tin. Bề ngang tối thiểu 600px, cao theo iframe</w:t>
+            </w:r>
+          </w:p>
+        </w:tc>
+        <w:tc>
+          <w:tcPr>
+            <w:tcW w:type="dxa" w:w="2000"/>
+          </w:tcPr>
+          <w:p>
+            <w:r/>
+            <w:r>
+              <w:rPr>
+                <w:sz w:val="19"/>
+              </w:rPr>
+              <w:t xml:space="preserve">nằm trong popup app rộng ≤ 900px</w:t>
+            </w:r>
+          </w:p>
+        </w:tc>
+      </w:tr>
+      <w:tr>
+        <w:tc>
+          <w:tcPr>
+            <w:tcW w:type="dxa" w:w="2600"/>
+          </w:tcPr>
+          <w:p>
+            <w:r/>
+            <w:r>
+              <w:rPr>
+                <w:sz w:val="19"/>
+              </w:rPr>
+              <w:t xml:space="preserve">2. Cửa /ho-tro/gui với cheDo = "nhung"</w:t>
+            </w:r>
+          </w:p>
+        </w:tc>
+        <w:tc>
+          <w:tcPr>
+            <w:tcW w:type="dxa" w:w="5372"/>
+          </w:tcPr>
+          <w:p>
+            <w:r/>
+            <w:r>
+              <w:rPr>
+                <w:sz w:val="19"/>
+              </w:rPr>
+              <w:t xml:space="preserve">Xác thực token, tạo yêu cầu, rồi trả ngay trang vấn đề nhúng (thay trang nhỏ của bước 3a), vẫn postMessage help-ho-tro-xong</w:t>
+            </w:r>
+          </w:p>
+        </w:tc>
+        <w:tc>
+          <w:tcPr>
+            <w:tcW w:type="dxa" w:w="2000"/>
+          </w:tcPr>
+          <w:p>
+            <w:r/>
+            <w:r>
+              <w:rPr>
+                <w:sz w:val="19"/>
+              </w:rPr>
+              <w:t xml:space="preserve">một bước, không nạp lại</w:t>
+            </w:r>
+          </w:p>
+        </w:tc>
+      </w:tr>
+      <w:tr>
+        <w:tc>
+          <w:tcPr>
+            <w:tcW w:type="dxa" w:w="2600"/>
+          </w:tcPr>
+          <w:p>
+            <w:r/>
+            <w:r>
+              <w:rPr>
+                <w:sz w:val="19"/>
+              </w:rPr>
+              <w:t xml:space="preserve">3. KHÔNG dùng cookie trong chế độ nhúng</w:t>
+            </w:r>
+          </w:p>
+        </w:tc>
+        <w:tc>
+          <w:tcPr>
+            <w:tcW w:type="dxa" w:w="5372"/>
+          </w:tcPr>
+          <w:p>
+            <w:r/>
+            <w:r>
+              <w:rPr>
+                <w:sz w:val="19"/>
+              </w:rPr>
+              <w:t xml:space="preserve">Cookie bên thứ ba trong iframe bị Safari và Edge chế độ Strict chặn. Help giữ một token phiên nhúng (~60 phút) ngay trong trang, gửi kèm header Authorization cho mọi API chat / tải ảnh / đã đọc / thời gian thực. Hết hạn → postMessage help-phien-het, app POST token SSO mới vào iframe</w:t>
+            </w:r>
+          </w:p>
+        </w:tc>
+        <w:tc>
+          <w:tcPr>
+            <w:tcW w:type="dxa" w:w="2000"/>
+          </w:tcPr>
+          <w:p>
+            <w:r/>
+            <w:r>
+              <w:rPr>
+                <w:sz w:val="19"/>
+              </w:rPr>
+              <w:t xml:space="preserve">điểm quyết định có làm được hay không</w:t>
+            </w:r>
+          </w:p>
+        </w:tc>
+      </w:tr>
+      <w:tr>
+        <w:tc>
+          <w:tcPr>
+            <w:tcW w:type="dxa" w:w="2600"/>
+          </w:tcPr>
+          <w:p>
+            <w:r/>
+            <w:r>
+              <w:rPr>
+                <w:sz w:val="19"/>
+              </w:rPr>
+              <w:t xml:space="preserve">4. Cho phép nhúng từ tên miền trường</w:t>
+            </w:r>
+          </w:p>
+        </w:tc>
+        <w:tc>
+          <w:tcPr>
+            <w:tcW w:type="dxa" w:w="5372"/>
+          </w:tcPr>
+          <w:p>
+            <w:r/>
+            <w:r>
+              <w:rPr>
+                <w:sz w:val="19"/>
+              </w:rPr>
+              <w:t xml:space="preserve">Trang nhúng trả Content-Security-Policy: frame-ancestors &lt;tên miền trường theo sổ trường&gt; (cùng danh sách CORS ở 10.3); không trả X-Frame-Options DENY / SAMEORIGIN cho trang này</w:t>
+            </w:r>
+          </w:p>
+        </w:tc>
+        <w:tc>
+          <w:tcPr>
+            <w:tcW w:type="dxa" w:w="2000"/>
+          </w:tcPr>
+          <w:p>
+            <w:r/>
+            <w:r>
+              <w:rPr>
+                <w:sz w:val="19"/>
+              </w:rPr>
+              <w:t xml:space="preserve">trình duyệt chặn khung nếu thiếu</w:t>
+            </w:r>
+          </w:p>
+        </w:tc>
+      </w:tr>
+      <w:tr>
+        <w:tc>
+          <w:tcPr>
+            <w:tcW w:type="dxa" w:w="2600"/>
+          </w:tcPr>
+          <w:p>
+            <w:r/>
+            <w:r>
+              <w:rPr>
+                <w:sz w:val="19"/>
+              </w:rPr>
+              <w:t xml:space="preserve">5. postMessage ra app</w:t>
+            </w:r>
+          </w:p>
+        </w:tc>
+        <w:tc>
+          <w:tcPr>
+            <w:tcW w:type="dxa" w:w="5372"/>
+          </w:tcPr>
+          <w:p>
+            <w:r/>
+            <w:r>
+              <w:rPr>
+                <w:sz w:val="19"/>
+              </w:rPr>
+              <w:t xml:space="preserve">Bộ sự kiện ở 11.3, gửi tới window.parent với targetOrigin là tên miền app đã nhúng (lấy từ sổ trường), không dùng "*"</w:t>
+            </w:r>
+          </w:p>
+        </w:tc>
+        <w:tc>
+          <w:tcPr>
+            <w:tcW w:type="dxa" w:w="2000"/>
+          </w:tcPr>
+          <w:p>
+            <w:r/>
+            <w:r>
+              <w:rPr>
+                <w:sz w:val="19"/>
+              </w:rPr>
+              <w:t xml:space="preserve">bảng app cập nhật không gọi lại cửa danh sách</w:t>
+            </w:r>
+          </w:p>
+        </w:tc>
+      </w:tr>
+      <w:tr>
+        <w:tc>
+          <w:tcPr>
+            <w:tcW w:type="dxa" w:w="2600"/>
+          </w:tcPr>
+          <w:p>
+            <w:r/>
+            <w:r>
+              <w:rPr>
+                <w:sz w:val="19"/>
+              </w:rPr>
+              <w:t xml:space="preserve">6. Lưu trữ trong iframe</w:t>
+            </w:r>
+          </w:p>
+        </w:tc>
+        <w:tc>
+          <w:tcPr>
+            <w:tcW w:type="dxa" w:w="5372"/>
+          </w:tcPr>
+          <w:p>
+            <w:r/>
+            <w:r>
+              <w:rPr>
+                <w:sz w:val="19"/>
+              </w:rPr>
+              <w:t xml:space="preserve">Không dựa vào localStorage / sessionStorage giữa các lần mở (bị phân vùng theo trang cha); nháp tin đang gõ giữ trong trang là đủ</w:t>
+            </w:r>
+          </w:p>
+        </w:tc>
+        <w:tc>
+          <w:tcPr>
+            <w:tcW w:type="dxa" w:w="2000"/>
+          </w:tcPr>
+          <w:p>
+            <w:r/>
+            <w:r>
+              <w:rPr>
+                <w:sz w:val="19"/>
+              </w:rPr>
+              <w:t xml:space="preserve">tránh mất nháp, mất đã đọc</w:t>
+            </w:r>
+          </w:p>
+        </w:tc>
+      </w:tr>
+    </w:tbl>
+    <w:p/>
+    <w:p>
+      <w:pPr>
+        <w:pStyle w:val="Heading2"/>
+      </w:pPr>
+      <w:r>
+        <w:t xml:space="preserve">11.3 Bộ sự kiện postMessage (iframe Help → app)</w:t>
+      </w:r>
+    </w:p>
+    <w:p>
+      <w:r>
+        <w:t xml:space="preserve">Mọi message có dạng { loai, id, … }. App chỉ nhận message có event.origin là tên miền Help; Help chỉ gửi tới origin app đã nhúng.</w:t>
+      </w:r>
+    </w:p>
+    <w:tbl>
+      <w:tblPr>
+        <w:tblStyle w:val="TableGrid"/>
+        <w:tblW w:type="auto" w:w="0"/>
+        <w:tblLook w:firstColumn="1" w:firstRow="1" w:lastColumn="0" w:lastRow="0" w:noHBand="0" w:noVBand="1" w:val="04A0"/>
+      </w:tblPr>
+      <w:tblGrid>
+        <w:gridCol w:w="2600"/>
+        <w:gridCol w:w="3200"/>
+        <w:gridCol w:w="4172"/>
+      </w:tblGrid>
+      <w:tr>
+        <w:tc>
+          <w:tcPr>
+            <w:tcW w:type="dxa" w:w="2600"/>
+            <w:shd w:val="clear" w:color="auto" w:fill="EFF6FF"/>
+          </w:tcPr>
+          <w:p>
+            <w:r/>
+            <w:r>
+              <w:rPr>
+                <w:b/>
+                <w:sz w:val="19"/>
+              </w:rPr>
+              <w:t xml:space="preserve">loai</w:t>
+            </w:r>
+          </w:p>
+        </w:tc>
+        <w:tc>
+          <w:tcPr>
+            <w:tcW w:type="dxa" w:w="3200"/>
+            <w:shd w:val="clear" w:color="auto" w:fill="EFF6FF"/>
+          </w:tcPr>
+          <w:p>
+            <w:r/>
+            <w:r>
+              <w:rPr>
+                <w:b/>
+                <w:sz w:val="19"/>
+              </w:rPr>
+              <w:t xml:space="preserve">Dữ liệu kèm</w:t>
+            </w:r>
+          </w:p>
+        </w:tc>
+        <w:tc>
+          <w:tcPr>
+            <w:tcW w:type="dxa" w:w="4172"/>
+            <w:shd w:val="clear" w:color="auto" w:fill="EFF6FF"/>
+          </w:tcPr>
+          <w:p>
+            <w:r/>
+            <w:r>
+              <w:rPr>
+                <w:b/>
+                <w:sz w:val="19"/>
+              </w:rPr>
+              <w:t xml:space="preserve">App làm gì</w:t>
+            </w:r>
+          </w:p>
+        </w:tc>
+      </w:tr>
+      <w:tr>
+        <w:tc>
+          <w:tcPr>
+            <w:tcW w:type="dxa" w:w="2600"/>
+          </w:tcPr>
+          <w:p>
+            <w:r/>
+            <w:r>
+              <w:rPr>
+                <w:sz w:val="19"/>
+              </w:rPr>
+              <w:t xml:space="preserve">help-ho-tro-xong (đã có từ bản 0.4)</w:t>
+            </w:r>
+          </w:p>
+        </w:tc>
+        <w:tc>
+          <w:tcPr>
+            <w:tcW w:type="dxa" w:w="3200"/>
+          </w:tcPr>
+          <w:p>
+            <w:r/>
+            <w:r>
+              <w:rPr>
+                <w:sz w:val="19"/>
+              </w:rPr>
+              <w:t xml:space="preserve">ok, id, maHienThi, url, soTuongTu</w:t>
+            </w:r>
+          </w:p>
+        </w:tc>
+        <w:tc>
+          <w:tcPr>
+            <w:tcW w:type="dxa" w:w="4172"/>
+          </w:tcPr>
+          <w:p>
+            <w:r/>
+            <w:r>
+              <w:rPr>
+                <w:sz w:val="19"/>
+              </w:rPr>
+              <w:t xml:space="preserve">chèn dòng mới lên đầu bảng, chuyển popup sang chế độ chat</w:t>
+            </w:r>
+          </w:p>
+        </w:tc>
+      </w:tr>
+      <w:tr>
+        <w:tc>
+          <w:tcPr>
+            <w:tcW w:type="dxa" w:w="2600"/>
+          </w:tcPr>
+          <w:p>
+            <w:r/>
+            <w:r>
+              <w:rPr>
+                <w:sz w:val="19"/>
+              </w:rPr>
+              <w:t xml:space="preserve">help-san-sang</w:t>
+            </w:r>
+          </w:p>
+        </w:tc>
+        <w:tc>
+          <w:tcPr>
+            <w:tcW w:type="dxa" w:w="3200"/>
+          </w:tcPr>
+          <w:p>
+            <w:r/>
+            <w:r>
+              <w:rPr>
+                <w:sz w:val="19"/>
+              </w:rPr>
+              <w:t xml:space="preserve">id</w:t>
+            </w:r>
+          </w:p>
+        </w:tc>
+        <w:tc>
+          <w:tcPr>
+            <w:tcW w:type="dxa" w:w="4172"/>
+          </w:tcPr>
+          <w:p>
+            <w:r/>
+            <w:r>
+              <w:rPr>
+                <w:sz w:val="19"/>
+              </w:rPr>
+              <w:t xml:space="preserve">tắt đồng hồ lối lui 10 giây, ẩn thông báo "đang mở"</w:t>
+            </w:r>
+          </w:p>
+        </w:tc>
+      </w:tr>
+      <w:tr>
+        <w:tc>
+          <w:tcPr>
+            <w:tcW w:type="dxa" w:w="2600"/>
+          </w:tcPr>
+          <w:p>
+            <w:r/>
+            <w:r>
+              <w:rPr>
+                <w:sz w:val="19"/>
+              </w:rPr>
+              <w:t xml:space="preserve">help-trang-thai</w:t>
+            </w:r>
+          </w:p>
+        </w:tc>
+        <w:tc>
+          <w:tcPr>
+            <w:tcW w:type="dxa" w:w="3200"/>
+          </w:tcPr>
+          <w:p>
+            <w:r/>
+            <w:r>
+              <w:rPr>
+                <w:sz w:val="19"/>
+              </w:rPr>
+              <w:t xml:space="preserve">id, trangThai (mã), ten, mau</w:t>
+            </w:r>
+          </w:p>
+        </w:tc>
+        <w:tc>
+          <w:tcPr>
+            <w:tcW w:type="dxa" w:w="4172"/>
+          </w:tcPr>
+          <w:p>
+            <w:r/>
+            <w:r>
+              <w:rPr>
+                <w:sz w:val="19"/>
+              </w:rPr>
+              <w:t xml:space="preserve">đổi nhãn trạng thái trên dòng tương ứng</w:t>
+            </w:r>
+          </w:p>
+        </w:tc>
+      </w:tr>
+      <w:tr>
+        <w:tc>
+          <w:tcPr>
+            <w:tcW w:type="dxa" w:w="2600"/>
+          </w:tcPr>
+          <w:p>
+            <w:r/>
+            <w:r>
+              <w:rPr>
+                <w:sz w:val="19"/>
+              </w:rPr>
+              <w:t xml:space="preserve">help-tin-moi</w:t>
+            </w:r>
+          </w:p>
+        </w:tc>
+        <w:tc>
+          <w:tcPr>
+            <w:tcW w:type="dxa" w:w="3200"/>
+          </w:tcPr>
+          <w:p>
+            <w:r/>
+            <w:r>
+              <w:rPr>
+                <w:sz w:val="19"/>
+              </w:rPr>
+              <w:t xml:space="preserve">id, soChuaDoc</w:t>
+            </w:r>
+          </w:p>
+        </w:tc>
+        <w:tc>
+          <w:tcPr>
+            <w:tcW w:type="dxa" w:w="4172"/>
+          </w:tcPr>
+          <w:p>
+            <w:r/>
+            <w:r>
+              <w:rPr>
+                <w:sz w:val="19"/>
+              </w:rPr>
+              <w:t xml:space="preserve">đổi số phản hồi chưa đọc trên dòng; về 0 khi người dùng đã xem</w:t>
+            </w:r>
+          </w:p>
+        </w:tc>
+      </w:tr>
+      <w:tr>
+        <w:tc>
+          <w:tcPr>
+            <w:tcW w:type="dxa" w:w="2600"/>
+          </w:tcPr>
+          <w:p>
+            <w:r/>
+            <w:r>
+              <w:rPr>
+                <w:sz w:val="19"/>
+              </w:rPr>
+              <w:t xml:space="preserve">help-phien-het</w:t>
+            </w:r>
+          </w:p>
+        </w:tc>
+        <w:tc>
+          <w:tcPr>
+            <w:tcW w:type="dxa" w:w="3200"/>
+          </w:tcPr>
+          <w:p>
+            <w:r/>
+            <w:r>
+              <w:rPr>
+                <w:sz w:val="19"/>
+              </w:rPr>
+              <w:t xml:space="preserve">id</w:t>
+            </w:r>
+          </w:p>
+        </w:tc>
+        <w:tc>
+          <w:tcPr>
+            <w:tcW w:type="dxa" w:w="4172"/>
+          </w:tcPr>
+          <w:p>
+            <w:r/>
+            <w:r>
+              <w:rPr>
+                <w:sz w:val="19"/>
+              </w:rPr>
+              <w:t xml:space="preserve">phát token SSO mới (help-sso.aspx json=1), POST lại vào iframe; Help giữ vị trí và nháp</w:t>
+            </w:r>
+          </w:p>
+        </w:tc>
+      </w:tr>
+      <w:tr>
+        <w:tc>
+          <w:tcPr>
+            <w:tcW w:type="dxa" w:w="2600"/>
+          </w:tcPr>
+          <w:p>
+            <w:r/>
+            <w:r>
+              <w:rPr>
+                <w:sz w:val="19"/>
+              </w:rPr>
+              <w:t xml:space="preserve">help-loi</w:t>
+            </w:r>
+          </w:p>
+        </w:tc>
+        <w:tc>
+          <w:tcPr>
+            <w:tcW w:type="dxa" w:w="3200"/>
+          </w:tcPr>
+          <w:p>
+            <w:r/>
+            <w:r>
+              <w:rPr>
+                <w:sz w:val="19"/>
+              </w:rPr>
+              <w:t xml:space="preserve">loi, thongBao</w:t>
+            </w:r>
+          </w:p>
+        </w:tc>
+        <w:tc>
+          <w:tcPr>
+            <w:tcW w:type="dxa" w:w="4172"/>
+          </w:tcPr>
+          <w:p>
+            <w:r/>
+            <w:r>
+              <w:rPr>
+                <w:sz w:val="19"/>
+              </w:rPr>
+              <w:t xml:space="preserve">hiện thongBao trong popup kèm nút "Mở trong Help" (lối lui)</w:t>
+            </w:r>
+          </w:p>
+        </w:tc>
+      </w:tr>
+    </w:tbl>
+    <w:p/>
+    <w:p>
+      <w:r>
+        <w:t xml:space="preserve">Chiều app → iframe không cần kênh riêng: mọi thứ đi bằng POST form (token, id, v). Tuỳ chọn: app gửi { loai: "app-dong" } trước khi đóng popup để Help lưu nháp.</w:t>
+      </w:r>
+    </w:p>
+    <w:p>
+      <w:pPr>
+        <w:pStyle w:val="Heading2"/>
+      </w:pPr>
+      <w:r>
+        <w:t xml:space="preserve">11.4 Phía app làm</w:t>
+      </w:r>
+    </w:p>
+    <w:p>
+      <w:pPr>
+        <w:pStyle w:val="ListBullet"/>
+      </w:pPr>
+      <w:r>
+        <w:t xml:space="preserve">Popup: một nút "Gửi"; sau gửi, vùng ảnh + ô mô tả thu lại, iframe chat chiếm phần còn lại (cao khoảng 60vh); thanh đầu popup giữ dòng ngữ cảnh và nhãn trạng thái lấy từ postMessage.</w:t>
+      </w:r>
+    </w:p>
+    <w:p>
+      <w:pPr>
+        <w:pStyle w:val="ListBullet"/>
+      </w:pPr>
+      <w:r>
+        <w:t xml:space="preserve">Bảng "Yêu cầu của tôi": bấm dòng → popup chat (POST token + id vào iframe) thay cho mở tab; cập nhật dòng theo help-trang-thai / help-tin-moi.</w:t>
+      </w:r>
+    </w:p>
+    <w:p>
+      <w:pPr>
+        <w:pStyle w:val="ListBullet"/>
+      </w:pPr>
+      <w:r>
+        <w:t xml:space="preserve">Lối lui 10 giây và nút "Mở trong Help"; mỗi lần Help báo help-phien-het thì phát token mới và POST lại.</w:t>
+      </w:r>
+    </w:p>
+    <w:p>
+      <w:pPr>
+        <w:pStyle w:val="ListBullet"/>
+      </w:pPr>
+      <w:r>
+        <w:t xml:space="preserve">Bỏ: nút "Chi tiết hơn", mở tab help-portal từ popup và từ bảng. Giữ: toàn bộ chụp / sửa ảnh, cửa danh sách 10.2, cơ chế iframe + postMessage của gửi nhanh.</w:t>
+      </w:r>
+    </w:p>
+    <w:p>
+      <w:pPr>
+        <w:pStyle w:val="Heading2"/>
+      </w:pPr>
+      <w:r>
+        <w:t xml:space="preserve">11.5 Được và mất so với chuyển url (để Help cùng cân)</w:t>
+      </w:r>
+    </w:p>
+    <w:tbl>
+      <w:tblPr>
+        <w:tblStyle w:val="TableGrid"/>
+        <w:tblW w:type="auto" w:w="0"/>
+        <w:tblLook w:firstColumn="1" w:firstRow="1" w:lastColumn="0" w:lastRow="0" w:noHBand="0" w:noVBand="1" w:val="04A0"/>
+      </w:tblPr>
+      <w:tblGrid>
+        <w:gridCol w:w="4986"/>
+        <w:gridCol w:w="4986"/>
+      </w:tblGrid>
+      <w:tr>
+        <w:tc>
+          <w:tcPr>
+            <w:tcW w:type="dxa" w:w="4986"/>
+            <w:shd w:val="clear" w:color="auto" w:fill="EFF6FF"/>
+          </w:tcPr>
+          <w:p>
+            <w:r/>
+            <w:r>
+              <w:rPr>
+                <w:b/>
+                <w:sz w:val="19"/>
+              </w:rPr>
+              <w:t xml:space="preserve">Được</w:t>
+            </w:r>
+          </w:p>
+        </w:tc>
+        <w:tc>
+          <w:tcPr>
+            <w:tcW w:type="dxa" w:w="4986"/>
+            <w:shd w:val="clear" w:color="auto" w:fill="EFF6FF"/>
+          </w:tcPr>
+          <w:p>
+            <w:r/>
+            <w:r>
+              <w:rPr>
+                <w:b/>
+                <w:sz w:val="19"/>
+              </w:rPr>
+              <w:t xml:space="preserve">Mất / rủi ro</w:t>
+            </w:r>
+          </w:p>
+        </w:tc>
+      </w:tr>
+      <w:tr>
+        <w:tc>
+          <w:tcPr>
+            <w:tcW w:type="dxa" w:w="4986"/>
+          </w:tcPr>
+          <w:p>
+            <w:r/>
+            <w:r>
+              <w:rPr>
+                <w:sz w:val="19"/>
+              </w:rPr>
+              <w:t xml:space="preserve">Người dùng không rời màn đang làm; gửi xong thấy ngay phản hồi, không đăng nhập lại Help, không tự tìm lại yêu cầu</w:t>
+            </w:r>
+          </w:p>
+        </w:tc>
+        <w:tc>
+          <w:tcPr>
+            <w:tcW w:type="dxa" w:w="4986"/>
+          </w:tcPr>
+          <w:p>
+            <w:r/>
+            <w:r>
+              <w:rPr>
+                <w:sz w:val="19"/>
+              </w:rPr>
+              <w:t xml:space="preserve">Phụ thuộc Help làm đúng chế độ nhúng KHÔNG cookie; làm bằng cookie thì chat chết trên Safari / Edge Strict (mở tab không bao giờ gặp)</w:t>
+            </w:r>
+          </w:p>
+        </w:tc>
+      </w:tr>
+      <w:tr>
+        <w:tc>
+          <w:tcPr>
+            <w:tcW w:type="dxa" w:w="4986"/>
+          </w:tcPr>
+          <w:p>
+            <w:r/>
+            <w:r>
+              <w:rPr>
+                <w:sz w:val="19"/>
+              </w:rPr>
+              <w:t xml:space="preserve">Bảng và chat cùng một chỗ; trạng thái, số tin mới cập nhật qua postMessage, không gọi lại cửa danh sách</w:t>
+            </w:r>
+          </w:p>
+        </w:tc>
+        <w:tc>
+          <w:tcPr>
+            <w:tcW w:type="dxa" w:w="4986"/>
+          </w:tcPr>
+          <w:p>
+            <w:r/>
+            <w:r>
+              <w:rPr>
+                <w:sz w:val="19"/>
+              </w:rPr>
+              <w:t xml:space="preserve">Khung chat bó trong popup ≤ 900px, chật hơn cả trang Help với trao đổi dài, nhiều ảnh</w:t>
+            </w:r>
+          </w:p>
+        </w:tc>
+      </w:tr>
+      <w:tr>
+        <w:tc>
+          <w:tcPr>
+            <w:tcW w:type="dxa" w:w="4986"/>
+          </w:tcPr>
+          <w:p>
+            <w:r/>
+            <w:r>
+              <w:rPr>
+                <w:sz w:val="19"/>
+              </w:rPr>
+              <w:t xml:space="preserve">Ít bước: một nút gửi, không trang xác nhận, không trang "chi tiết hơn"</w:t>
+            </w:r>
+          </w:p>
+        </w:tc>
+        <w:tc>
+          <w:tcPr>
+            <w:tcW w:type="dxa" w:w="4986"/>
+          </w:tcPr>
+          <w:p>
+            <w:r/>
+            <w:r>
+              <w:rPr>
+                <w:sz w:val="19"/>
+              </w:rPr>
+              <w:t xml:space="preserve">Lỗi trong iframe tên miền khác app không đọc được; chỉ biết qua help-loi hoặc hết 10 giây → cần lối lui</w:t>
+            </w:r>
+          </w:p>
+        </w:tc>
+      </w:tr>
+      <w:tr>
+        <w:tc>
+          <w:tcPr>
+            <w:tcW w:type="dxa" w:w="4986"/>
+          </w:tcPr>
+          <w:p>
+            <w:r/>
+            <w:r>
+              <w:rPr>
+                <w:sz w:val="19"/>
+              </w:rPr>
+              <w:t xml:space="preserve">Bớt lỗi hay gặp: tab bị chặn popup, tab bị đóng, token hết hạn khi tab mở chậm</w:t>
+            </w:r>
+          </w:p>
+        </w:tc>
+        <w:tc>
+          <w:tcPr>
+            <w:tcW w:type="dxa" w:w="4986"/>
+          </w:tcPr>
+          <w:p>
+            <w:r/>
+            <w:r>
+              <w:rPr>
+                <w:sz w:val="19"/>
+              </w:rPr>
+              <w:t xml:space="preserve">Thêm vài ngày việc phía Help (chế độ nhúng, token phiên, CSP, sự kiện); phía app ít</w:t>
+            </w:r>
+          </w:p>
+        </w:tc>
+      </w:tr>
+    </w:tbl>
+    <w:p/>
+    <w:p>
+      <w:pPr>
+        <w:pStyle w:val="Heading2"/>
+      </w:pPr>
+      <w:r>
+        <w:t xml:space="preserve">11.6 Câu hỏi với Help — trả lời trước khi chốt</w:t>
+      </w:r>
+    </w:p>
+    <w:tbl>
+      <w:tblPr>
+        <w:tblStyle w:val="TableGrid"/>
+        <w:tblW w:type="auto" w:w="0"/>
+        <w:tblLook w:firstColumn="1" w:firstRow="1" w:lastColumn="0" w:lastRow="0" w:noHBand="0" w:noVBand="1" w:val="04A0"/>
+      </w:tblPr>
+      <w:tblGrid>
+        <w:gridCol w:w="4986"/>
+        <w:gridCol w:w="4986"/>
+      </w:tblGrid>
+      <w:tr>
+        <w:tc>
+          <w:tcPr>
+            <w:tcW w:type="dxa" w:w="4986"/>
+            <w:shd w:val="clear" w:color="auto" w:fill="EFF6FF"/>
+          </w:tcPr>
+          <w:p>
+            <w:r/>
+            <w:r>
+              <w:rPr>
+                <w:b/>
+                <w:sz w:val="19"/>
+              </w:rPr>
+              <w:t xml:space="preserve">Câu hỏi</w:t>
+            </w:r>
+          </w:p>
+        </w:tc>
+        <w:tc>
+          <w:tcPr>
+            <w:tcW w:type="dxa" w:w="4986"/>
+            <w:shd w:val="clear" w:color="auto" w:fill="EFF6FF"/>
+          </w:tcPr>
+          <w:p>
+            <w:r/>
+            <w:r>
+              <w:rPr>
+                <w:b/>
+                <w:sz w:val="19"/>
+              </w:rPr>
+              <w:t xml:space="preserve">Đội app đề nghị</w:t>
+            </w:r>
+          </w:p>
+        </w:tc>
+      </w:tr>
+      <w:tr>
+        <w:tc>
+          <w:tcPr>
+            <w:tcW w:type="dxa" w:w="4986"/>
+          </w:tcPr>
+          <w:p>
+            <w:r/>
+            <w:r>
+              <w:rPr>
+                <w:sz w:val="19"/>
+              </w:rPr>
+              <w:t xml:space="preserve">Trang vấn đề hiện xác thực bằng cookie phiên hay token? Chat thời gian thực bằng gì (WebSocket / SSE / thăm dò) và có chạy với header Authorization không?</w:t>
+            </w:r>
+          </w:p>
+        </w:tc>
+        <w:tc>
+          <w:tcPr>
+            <w:tcW w:type="dxa" w:w="4986"/>
+          </w:tcPr>
+          <w:p>
+            <w:r/>
+            <w:r>
+              <w:rPr>
+                <w:sz w:val="19"/>
+              </w:rPr>
+              <w:t xml:space="preserve">Đây là câu quyết định. Nếu đang là cookie, Help ước lượng công chuyển sang token phiên nhúng rồi hai bên mới chốt</w:t>
+            </w:r>
+          </w:p>
+        </w:tc>
+      </w:tr>
+      <w:tr>
+        <w:tc>
+          <w:tcPr>
+            <w:tcW w:type="dxa" w:w="4986"/>
+          </w:tcPr>
+          <w:p>
+            <w:r/>
+            <w:r>
+              <w:rPr>
+                <w:sz w:val="19"/>
+              </w:rPr>
+              <w:t xml:space="preserve">Tiêu đề, mức ưu tiên, nhiều ảnh (form "Chi tiết hơn" cũ) xử lý thế nào?</w:t>
+            </w:r>
+          </w:p>
+        </w:tc>
+        <w:tc>
+          <w:tcPr>
+            <w:tcW w:type="dxa" w:w="4986"/>
+          </w:tcPr>
+          <w:p>
+            <w:r/>
+            <w:r>
+              <w:rPr>
+                <w:sz w:val="19"/>
+              </w:rPr>
+              <w:t xml:space="preserve">Gửi ngay rồi bổ sung trong khung chat; nhân viên đặt tiêu đề / ưu tiên khi tiếp nhận. Help thấy cần thì thêm hai ô này ở nút (i) của trang nhúng</w:t>
+            </w:r>
+          </w:p>
+        </w:tc>
+      </w:tr>
+      <w:tr>
+        <w:tc>
+          <w:tcPr>
+            <w:tcW w:type="dxa" w:w="4986"/>
+          </w:tcPr>
+          <w:p>
+            <w:r/>
+            <w:r>
+              <w:rPr>
+                <w:sz w:val="19"/>
+              </w:rPr>
+              <w:t xml:space="preserve">Giới hạn ảnh dán trong chat (số lượng, dung lượng) và có giữ nháp khi phiên hết không?</w:t>
+            </w:r>
+          </w:p>
+        </w:tc>
+        <w:tc>
+          <w:tcPr>
+            <w:tcW w:type="dxa" w:w="4986"/>
+          </w:tcPr>
+          <w:p>
+            <w:r/>
+            <w:r>
+              <w:rPr>
+                <w:sz w:val="19"/>
+              </w:rPr>
+              <w:t xml:space="preserve">Giữ nháp trong trang; app POST token mới mà không nạp lại trang nếu Help làm được</w:t>
+            </w:r>
+          </w:p>
+        </w:tc>
+      </w:tr>
+      <w:tr>
+        <w:tc>
+          <w:tcPr>
+            <w:tcW w:type="dxa" w:w="4986"/>
+          </w:tcPr>
+          <w:p>
+            <w:r/>
+            <w:r>
+              <w:rPr>
+                <w:sz w:val="19"/>
+              </w:rPr>
+              <w:t xml:space="preserve">Help làm chế độ nhúng được ở đợt nào?</w:t>
+            </w:r>
+          </w:p>
+        </w:tc>
+        <w:tc>
+          <w:tcPr>
+            <w:tcW w:type="dxa" w:w="4986"/>
+          </w:tcPr>
+          <w:p>
+            <w:r/>
+            <w:r>
+              <w:rPr>
+                <w:sz w:val="19"/>
+              </w:rPr>
+              <w:t xml:space="preserve">Chưa có chế độ nhúng thì app giữ mục 10 (bấm dòng → tab); chuyển sang 11 khi Help báo lên máy chủ, không làm hai nửa</w:t>
+            </w:r>
+          </w:p>
+        </w:tc>
+      </w:tr>
+    </w:tbl>
+    <w:p/>
     <w:sectPr>
       <w:pgSz w:w="12240" w:h="15840"/>
       <w:pgMar w:top="1020" w:right="1134" w:bottom="1020" w:left="1134" w:header="720" w:footer="720" w:gutter="0"/>

</xml_diff>

<commit_message>
Plugin Yêu cầu hỗ trợ: chế độ nhúng (docx mục 11, Help trả lời 11.7, chủ dự án chốt 26/10) sau công tắc `nhung` mặc định tắt — popup một nút Gửi (cheDo nhung) rồi iframe trang vấn đề Help thay vùng ảnh; bấm dòng → POST token+id+v vào iframe /ho-tro/nhung; nhận help-san-sang/trang-thai/tin-moi/phien-het/loi, gửi app-token/app-dong; lối lui 10 s + nút Mở trong Help; thu-nhung.html giả lập Help; docx thêm 11.8 (app nhận ba chỉnh, phần đã làm)
Co-Authored-By: Claude Fable 5.1 <noreply@anthropic.com>
</commit_message>
<xml_diff>
--- a/nut-yeu-cau-ho-tro-tren-app.docx
+++ b/nut-yeu-cau-ho-tro-tren-app.docx
@@ -5068,6 +5068,577 @@
       </w:tr>
     </w:tbl>
     <w:p/>
+    <w:p>
+      <w:pPr>
+        <w:pStyle w:val="Heading1"/>
+      </w:pPr>
+      <w:r>
+        <w:t>11.7 Help trả lời mục 11 (26/10/2026) — làm được, đề nghị một chỉnh nhỏ, chờ chủ dự án chốt</w:t>
+      </w:r>
+    </w:p>
+    <w:p>
+      <w:r>
+        <w:t>Kết luận ngắn: Help LÀM ĐƯỢC chế độ nhúng như 11.2, không có điểm nào chặn. Ước lượng 2–3 ngày phía Help. Help đồng ý với lối lui 10 giây và với việc "không làm hai nửa": chỉ chuyển sang 11 khi chế độ nhúng đã lên máy chủ. Hai bên chờ chủ dự án chốt có làm đợt này không.</w:t>
+      </w:r>
+    </w:p>
+    <w:p>
+      <w:pPr>
+        <w:pStyle w:val="Heading2"/>
+      </w:pPr>
+      <w:r>
+        <w:t>Trả lời 11.6</w:t>
+      </w:r>
+    </w:p>
+    <w:tbl>
+      <w:tblPr>
+        <w:tblStyle w:val="TableGrid"/>
+        <w:tblW w:type="auto" w:w="0"/>
+        <w:tblLook w:firstColumn="1" w:firstRow="1" w:lastColumn="0" w:lastRow="0" w:noHBand="0" w:noVBand="1" w:val="04A0"/>
+      </w:tblPr>
+      <w:tblGrid>
+        <w:gridCol w:w="4986"/>
+        <w:gridCol w:w="4986"/>
+      </w:tblGrid>
+      <w:tr>
+        <w:tc>
+          <w:tcPr>
+            <w:tcW w:type="dxa" w:w="4986"/>
+            <w:shd w:val="clear" w:color="auto" w:fill="EFF6FF"/>
+          </w:tcPr>
+          <w:p>
+            <w:r/>
+            <w:r>
+              <w:rPr>
+                <w:b/>
+                <w:sz w:val="19"/>
+              </w:rPr>
+              <w:t>Câu hỏi</w:t>
+            </w:r>
+          </w:p>
+        </w:tc>
+        <w:tc>
+          <w:tcPr>
+            <w:tcW w:type="dxa" w:w="4986"/>
+            <w:shd w:val="clear" w:color="auto" w:fill="EFF6FF"/>
+          </w:tcPr>
+          <w:p>
+            <w:r/>
+            <w:r>
+              <w:rPr>
+                <w:b/>
+                <w:sz w:val="19"/>
+              </w:rPr>
+              <w:t>Trả lời của Help</w:t>
+            </w:r>
+          </w:p>
+        </w:tc>
+      </w:tr>
+      <w:tr>
+        <w:tc>
+          <w:tcPr>
+            <w:tcW w:type="dxa" w:w="4986"/>
+          </w:tcPr>
+          <w:p>
+            <w:r/>
+            <w:r>
+              <w:rPr>
+                <w:sz w:val="19"/>
+              </w:rPr>
+              <w:t>Trang vấn đề đang xác thực bằng cookie hay token? Chat thời gian thực bằng gì, có chạy với header Authorization không?</w:t>
+            </w:r>
+          </w:p>
+        </w:tc>
+        <w:tc>
+          <w:tcPr>
+            <w:tcW w:type="dxa" w:w="4986"/>
+          </w:tcPr>
+          <w:p>
+            <w:r/>
+            <w:r>
+              <w:rPr>
+                <w:sz w:val="19"/>
+              </w:rPr>
+              <w:t>Hai lớp: (1) cookie refresh eduhelp_rt (httpOnly, SameSite=Lax) CHỈ dùng một lần lúc tải trang để lấy access token; (2) toàn bộ API của trang vấn đề — chat, đính kèm, tải ảnh / tệp, đã đọc, thao tác — đều gửi header Authorization: Bearer &lt;access token&gt; giữ trong bộ nhớ trang, KHÔNG dựa vào cookie. Thời gian thực là thăm dò (polling) 5 giây bằng fetch kèm header, không WebSocket / SSE. Vì vậy phần phải đổi cho chế độ nhúng chỉ là bước (1): trong iframe, cookie bên thứ ba bị chặn nên trang nhúng phải nhận token từ POST của app rồi đổi lấy access token, không đặt cookie. Công: khoảng 1 ngày cho phần token + 1–2 ngày cho bố cục nhúng, CSP, bộ sự kiện postMessage, phép thử.</w:t>
+            </w:r>
+          </w:p>
+        </w:tc>
+      </w:tr>
+      <w:tr>
+        <w:tc>
+          <w:tcPr>
+            <w:tcW w:type="dxa" w:w="4986"/>
+          </w:tcPr>
+          <w:p>
+            <w:r/>
+            <w:r>
+              <w:rPr>
+                <w:sz w:val="19"/>
+              </w:rPr>
+              <w:t>Tiêu đề, mức ưu tiên, nhiều ảnh xử lý thế nào?</w:t>
+            </w:r>
+          </w:p>
+        </w:tc>
+        <w:tc>
+          <w:tcPr>
+            <w:tcW w:type="dxa" w:w="4986"/>
+          </w:tcPr>
+          <w:p>
+            <w:r/>
+            <w:r>
+              <w:rPr>
+                <w:sz w:val="19"/>
+              </w:rPr>
+              <w:t>Đồng ý: gửi ngay rồi bổ sung trong khung chat; nhân viên đặt tiêu đề / ưu tiên khi tiếp nhận. Help sẽ thêm ô sửa tiêu đề và ưu tiên ở nút (i) của trang nhúng (người gửi sửa được cho tới khi có người tiếp nhận; nhân viên sửa được luôn). Ảnh thêm: dán Ctrl+V hoặc kẹp giấy trong khung chat như hiện nay, mỗi lần gửi tối đa 5 tệp.</w:t>
+            </w:r>
+          </w:p>
+        </w:tc>
+      </w:tr>
+      <w:tr>
+        <w:tc>
+          <w:tcPr>
+            <w:tcW w:type="dxa" w:w="4986"/>
+          </w:tcPr>
+          <w:p>
+            <w:r/>
+            <w:r>
+              <w:rPr>
+                <w:sz w:val="19"/>
+              </w:rPr>
+              <w:t>Giới hạn ảnh dán trong chat và có giữ nháp khi phiên hết không?</w:t>
+            </w:r>
+          </w:p>
+        </w:tc>
+        <w:tc>
+          <w:tcPr>
+            <w:tcW w:type="dxa" w:w="4986"/>
+          </w:tcPr>
+          <w:p>
+            <w:r/>
+            <w:r>
+              <w:rPr>
+                <w:sz w:val="19"/>
+              </w:rPr>
+              <w:t>Ảnh ≤ 5 MB, tệp khác ≤ 10 MB (pdf, Word, Excel, PowerPoint, txt/log/csv/json, zip), tối đa 5 tệp một lần gửi. Nháp: Help đề nghị app KHÔNG POST lại vào iframe khi phiên hết (POST = nạp lại trang = mất nháp) mà gửi token mới bằng postMessage chiều app → iframe { loai: "app-token", token }; trang nhúng tự đổi lấy access token mới tại chỗ, giữ nguyên nháp, vị trí cuộn và tin đang hiện. Chỉ còn lần MỞ đầu tiên là POST form. Nếu app vẫn muốn POST lại thì Help giữ nháp bằng sessionStorage của chính iframe (vẫn sống trong cùng một lần mở popup dù bị phân vùng), nhưng kém hơn.</w:t>
+            </w:r>
+          </w:p>
+        </w:tc>
+      </w:tr>
+      <w:tr>
+        <w:tc>
+          <w:tcPr>
+            <w:tcW w:type="dxa" w:w="4986"/>
+          </w:tcPr>
+          <w:p>
+            <w:r/>
+            <w:r>
+              <w:rPr>
+                <w:sz w:val="19"/>
+              </w:rPr>
+              <w:t>Help làm chế độ nhúng được ở đợt nào?</w:t>
+            </w:r>
+          </w:p>
+        </w:tc>
+        <w:tc>
+          <w:tcPr>
+            <w:tcW w:type="dxa" w:w="4986"/>
+          </w:tcPr>
+          <w:p>
+            <w:r/>
+            <w:r>
+              <w:rPr>
+                <w:sz w:val="19"/>
+              </w:rPr>
+              <w:t>Mục 10 đã xong trên máy dev và lên máy chủ ở đợt cập nhật kế tiếp. Chế độ nhúng (mục 11) nếu chủ dự án chốt thì làm ngay sau đó, 2–3 ngày; app giữ mục 10 cho tới khi Help báo nhúng đã lên máy chủ. Không làm hai nửa.</w:t>
+            </w:r>
+          </w:p>
+        </w:tc>
+      </w:tr>
+    </w:tbl>
+    <w:p/>
+    <w:p>
+      <w:pPr>
+        <w:pStyle w:val="Heading2"/>
+      </w:pPr>
+      <w:r>
+        <w:t>Help sẽ làm, đúng 11.2, với ba chỉnh nhỏ</w:t>
+      </w:r>
+    </w:p>
+    <w:p>
+      <w:pPr>
+        <w:pStyle w:val="ListBullet"/>
+      </w:pPr>
+      <w:r>
+        <w:t>Địa chỉ trang nhúng: /ho-tro/nhung/&lt;id&gt; (không phải /ho-tro/van-de/&lt;id&gt;?nhung=1 — Help dùng /ho-tro/&lt;id&gt; cho trang thường, tách hẳn đường nhúng cho dễ đặt CSP). Mở từ bảng: app POST token + id (+ v) vào iframe tới /ho-tro/nhung; Help xác thực, phát access token nhúng sống 60 phút KHÔNG cookie, rồi mở trang vấn đề nhúng với token đó. Token không nằm trên URL: Help dùng mã dùng-một-lần sống 60 giây trong bước chuyển hướng.</w:t>
+      </w:r>
+    </w:p>
+    <w:p>
+      <w:pPr>
+        <w:pStyle w:val="ListBullet"/>
+      </w:pPr>
+      <w:r>
+        <w:t>Gửi từ popup: cửa /ho-tro/gui với cheDo = "nhung" tạo yêu cầu rồi mở thẳng trang nhúng của yêu cầu đó, vẫn postMessage help-ho-tro-xong (kèm maHienThi).</w:t>
+      </w:r>
+    </w:p>
+    <w:p>
+      <w:pPr>
+        <w:pStyle w:val="ListBullet"/>
+      </w:pPr>
+      <w:r>
+        <w:t>Bố cục nhúng: không header, không chân trang, không menu; chỉ dòng ngữ cảnh + nhãn trạng thái + nút (i) + khung chat. Bề ngang tối thiểu 600px, cao theo iframe.</w:t>
+      </w:r>
+    </w:p>
+    <w:p>
+      <w:pPr>
+        <w:pStyle w:val="ListBullet"/>
+      </w:pPr>
+      <w:r>
+        <w:t>CSP frame-ancestors: trang nhúng trả Content-Security-Policy: frame-ancestors &lt;các tên miền trong sổ trường của Help&gt; (cùng danh sách CORS ở 10.3); không trả X-Frame-Options cho trang này. Hôm nay Help chưa đặt X-Frame-Options / CSP nào nên không có gì phải gỡ; chỉ thêm cho đường /ho-tro/nhung/*. Trường mới khai ở sổ là nhúng được.</w:t>
+      </w:r>
+    </w:p>
+    <w:p>
+      <w:pPr>
+        <w:pStyle w:val="ListBullet"/>
+      </w:pPr>
+      <w:r>
+        <w:t>postMessage ra app đúng bộ 11.3 (help-san-sang, help-trang-thai, help-tin-moi, help-phien-het, help-loi, help-ho-tro-xong), targetOrigin = origin của trường đã nhúng (lấy từ sổ trường theo Origin của lần POST), không dùng "*". Thêm chiều app → iframe: { loai: "app-token", token } để gia hạn không nạp lại; tùy chọn { loai: "app-dong" } để Help lưu nháp.</w:t>
+      </w:r>
+    </w:p>
+    <w:p>
+      <w:pPr>
+        <w:pStyle w:val="ListBullet"/>
+      </w:pPr>
+      <w:r>
+        <w:t>Không dựa vào localStorage / sessionStorage giữa các lần mở; nháp giữ trong trang (và tùy chọn sessionStorage của iframe trong cùng lần mở).</w:t>
+      </w:r>
+    </w:p>
+    <w:p>
+      <w:pPr>
+        <w:pStyle w:val="Heading2"/>
+      </w:pPr>
+      <w:r>
+        <w:t>Điều Help muốn nêu để chủ dự án cân</w:t>
+      </w:r>
+    </w:p>
+    <w:p>
+      <w:pPr>
+        <w:pStyle w:val="ListBullet"/>
+      </w:pPr>
+      <w:r>
+        <w:t>Đồng ý với 11.5: cái được lớn nhất là người dùng không rời màn hình; cái mất là khung chat bó trong popup ≤ 900px. Help đề nghị GIỮ nút "Mở trong Help" luôn hiện (không chỉ là lối lui khi lỗi) để trao đổi dài, nhiều ảnh vẫn mở được bản đầy đủ ở tab help-portal; tab đó dùng cookie như thường, không ảnh hưởng chế độ nhúng.</w:t>
+      </w:r>
+    </w:p>
+    <w:p>
+      <w:pPr>
+        <w:pStyle w:val="ListBullet"/>
+      </w:pPr>
+      <w:r>
+        <w:t>Bỏ "Chi tiết hơn" là bỏ bước gợi ý trùng trước khi tạo (ba lựa chọn "Tôi cũng gặp"…). Help chấp nhận: gửi nhanh đã trả soTuongTu, và trong trang nhúng Help sẽ hiện dải "Có N yêu cầu tương tự đang mở — xem" ngay trên khung chat để người dùng vẫn bấm "Tôi cũng gặp" được sau khi tạo.</w:t>
+      </w:r>
+    </w:p>
+    <w:p>
+      <w:pPr>
+        <w:pStyle w:val="ListBullet"/>
+      </w:pPr>
+      <w:r>
+        <w:t>Rủi ro còn lại không nằm ở Help: trình duyệt / chính sách máy trường chặn iframe tên miền khác hoặc chặn lưu trữ phân vùng. Lối lui 10 giây + nút "Mở trong Help" là đủ; Help sẽ thử trên Edge chế độ Strict và Safari trước khi báo xong.</w:t>
+      </w:r>
+    </w:p>
+    <w:p>
+      <w:pPr>
+        <w:pStyle w:val="Heading1"/>
+      </w:pPr>
+      <w:r>
+        <w:t>11.8 Chốt 26/10/2026 (chủ dự án): làm chế độ nhúng theo 11.7 — phía app đã làm xong, chờ Help lên máy chủ</w:t>
+      </w:r>
+    </w:p>
+    <w:p>
+      <w:pPr/>
+      <w:r>
+        <w:t>Chủ dự án chốt làm mục 11 đúng như Help trả lời ở 11.7, kể cả ba chỉnh nhỏ. Đội app đã làm xong phần 11.4 trong plugin (_v2/assets/plugin/btn-yeucau-hotro), chạy được trên dữ liệu dựng thử với một trang giả lập trang nhúng của Help (thu-nhung.html, bắn đủ bộ sự kiện 11.3). Toàn bộ nằm sau MỘT công tắc cấu hình nhung, mặc định TẮT = phần mềm vẫn chạy mục 10. Không làm hai nửa: khi Help báo /ho-tro/nhung đã lên máy chủ, đội app bật công tắc (một chỗ, không sửa giao diện) rồi thử đầu-cuối. Help chỉ cần báo ngày.</w:t>
+      </w:r>
+    </w:p>
+    <w:p>
+      <w:pPr>
+        <w:pStyle w:val="Heading2"/>
+      </w:pPr>
+      <w:r>
+        <w:t>Đội app nhận ba chỉnh và các đề nghị của Help</w:t>
+      </w:r>
+    </w:p>
+    <w:tbl>
+      <w:tblPr>
+        <w:tblStyle w:val="TableGrid"/>
+        <w:tblW w:type="auto" w:w="0"/>
+        <w:tblLook w:firstColumn="1" w:firstRow="1" w:lastColumn="0" w:lastRow="0" w:noHBand="0" w:noVBand="1" w:val="04A0"/>
+      </w:tblPr>
+      <w:tblGrid>
+        <w:gridCol w:w="4986"/>
+        <w:gridCol w:w="4986"/>
+      </w:tblGrid>
+      <w:tr>
+        <w:tc>
+          <w:tcPr>
+            <w:tcW w:type="dxa" w:w="4986"/>
+            <w:shd w:val="clear" w:color="auto" w:fill="EFF6FF"/>
+          </w:tcPr>
+          <w:p>
+            <w:r/>
+            <w:r>
+              <w:rPr>
+                <w:b/>
+                <w:sz w:val="19"/>
+              </w:rPr>
+              <w:t>Help đề nghị (11.7)</w:t>
+            </w:r>
+          </w:p>
+        </w:tc>
+        <w:tc>
+          <w:tcPr>
+            <w:tcW w:type="dxa" w:w="4986"/>
+            <w:shd w:val="clear" w:color="auto" w:fill="EFF6FF"/>
+          </w:tcPr>
+          <w:p>
+            <w:r/>
+            <w:r>
+              <w:rPr>
+                <w:b/>
+                <w:sz w:val="19"/>
+              </w:rPr>
+              <w:t>App làm</w:t>
+            </w:r>
+          </w:p>
+        </w:tc>
+      </w:tr>
+      <w:tr>
+        <w:tc>
+          <w:tcPr>
+            <w:tcW w:type="dxa" w:w="4986"/>
+          </w:tcPr>
+          <w:p>
+            <w:r/>
+            <w:r>
+              <w:rPr>
+                <w:sz w:val="19"/>
+              </w:rPr>
+              <w:t>Địa chỉ trang nhúng /ho-tro/nhung; mở từ bảng: app POST token + id (+ v) vào iframe; token không nằm trên URL</w:t>
+            </w:r>
+          </w:p>
+        </w:tc>
+        <w:tc>
+          <w:tcPr>
+            <w:tcW w:type="dxa" w:w="4986"/>
+          </w:tcPr>
+          <w:p>
+            <w:r/>
+            <w:r>
+              <w:rPr>
+                <w:sz w:val="19"/>
+              </w:rPr>
+              <w:t>Đúng vậy: bấm dòng trong bảng → popup mở với iframe hiện sẵn, app phát token SSO mới rồi POST ba trường token, id, v vào iframe tới /ho-tro/nhung. Không gửi gì trên URL, không mở tab.</w:t>
+            </w:r>
+          </w:p>
+        </w:tc>
+      </w:tr>
+      <w:tr>
+        <w:tc>
+          <w:tcPr>
+            <w:tcW w:type="dxa" w:w="4986"/>
+          </w:tcPr>
+          <w:p>
+            <w:r/>
+            <w:r>
+              <w:rPr>
+                <w:sz w:val="19"/>
+              </w:rPr>
+              <w:t>Cửa /ho-tro/gui với cheDo = "nhung" trả thẳng trang nhúng, vẫn postMessage help-ho-tro-xong (kèm maHienThi)</w:t>
+            </w:r>
+          </w:p>
+        </w:tc>
+        <w:tc>
+          <w:tcPr>
+            <w:tcW w:type="dxa" w:w="4986"/>
+          </w:tcPr>
+          <w:p>
+            <w:r/>
+            <w:r>
+              <w:rPr>
+                <w:sz w:val="19"/>
+              </w:rPr>
+              <w:t>Form gửi (mục 4) target vào chính iframe trong popup, cheDo = "nhung". Nhận help-ho-tro-xong → chèn dòng mới lên đầu bảng, thu vùng ảnh / thanh vẽ / ô mô tả, iframe trở thành khung trao đổi; maHienThi và nhãn trạng thái lên dòng ngữ cảnh của popup.</w:t>
+            </w:r>
+          </w:p>
+        </w:tc>
+      </w:tr>
+      <w:tr>
+        <w:tc>
+          <w:tcPr>
+            <w:tcW w:type="dxa" w:w="4986"/>
+          </w:tcPr>
+          <w:p>
+            <w:r/>
+            <w:r>
+              <w:rPr>
+                <w:sz w:val="19"/>
+              </w:rPr>
+              <w:t>Gia hạn bằng postMessage app → iframe { loai: "app-token", token } thay vì POST lại; tuỳ chọn { loai: "app-dong" }</w:t>
+            </w:r>
+          </w:p>
+        </w:tc>
+        <w:tc>
+          <w:tcPr>
+            <w:tcW w:type="dxa" w:w="4986"/>
+          </w:tcPr>
+          <w:p>
+            <w:r/>
+            <w:r>
+              <w:rPr>
+                <w:sz w:val="19"/>
+              </w:rPr>
+              <w:t>Đồng ý, đã làm: help-phien-het → app phát token SSO mới và gửi app-token vào iframe (targetOrigin = origin Help), không nạp lại trang. Trước khi đóng popup app gửi app-dong; popup ẩn tức thì nhưng iframe chỉ gỡ sau 200 ms để Help kịp nhận (postMessage giao không đồng bộ).</w:t>
+            </w:r>
+          </w:p>
+        </w:tc>
+      </w:tr>
+      <w:tr>
+        <w:tc>
+          <w:tcPr>
+            <w:tcW w:type="dxa" w:w="4986"/>
+          </w:tcPr>
+          <w:p>
+            <w:r/>
+            <w:r>
+              <w:rPr>
+                <w:sz w:val="19"/>
+              </w:rPr>
+              <w:t>Giữ nút "Mở trong Help" luôn hiện, không chỉ khi lỗi</w:t>
+            </w:r>
+          </w:p>
+        </w:tc>
+        <w:tc>
+          <w:tcPr>
+            <w:tcW w:type="dxa" w:w="4986"/>
+          </w:tcPr>
+          <w:p>
+            <w:r/>
+            <w:r>
+              <w:rPr>
+                <w:sz w:val="19"/>
+              </w:rPr>
+              <w:t>Đồng ý: nút ở chân popup, hiện ngay khi yêu cầu đã có url; thành nút chính khi hết 10 giây không có help-san-sang hoặc khi nhận help-loi. Tab mở vẫn là help-portal (trùng nút "?").</w:t>
+            </w:r>
+          </w:p>
+        </w:tc>
+      </w:tr>
+      <w:tr>
+        <w:tc>
+          <w:tcPr>
+            <w:tcW w:type="dxa" w:w="4986"/>
+          </w:tcPr>
+          <w:p>
+            <w:r/>
+            <w:r>
+              <w:rPr>
+                <w:sz w:val="19"/>
+              </w:rPr>
+              <w:t>Bỏ "Chi tiết hơn"; Help hiện dải "Có N yêu cầu tương tự đang mở" ngay trên khung chat của trang nhúng</w:t>
+            </w:r>
+          </w:p>
+        </w:tc>
+        <w:tc>
+          <w:tcPr>
+            <w:tcW w:type="dxa" w:w="4986"/>
+          </w:tcPr>
+          <w:p>
+            <w:r/>
+            <w:r>
+              <w:rPr>
+                <w:sz w:val="19"/>
+              </w:rPr>
+              <w:t>Đồng ý. App bỏ nút "Chi tiết hơn" khi bật nhung, không dựng gì thêm cho soTuongTu — để Help hiện trong trang nhúng.</w:t>
+            </w:r>
+          </w:p>
+        </w:tc>
+      </w:tr>
+      <w:tr>
+        <w:tc>
+          <w:tcPr>
+            <w:tcW w:type="dxa" w:w="4986"/>
+          </w:tcPr>
+          <w:p>
+            <w:r/>
+            <w:r>
+              <w:rPr>
+                <w:sz w:val="19"/>
+              </w:rPr>
+              <w:t>Help thử trên Edge chế độ Strict và Safari trước khi báo xong</w:t>
+            </w:r>
+          </w:p>
+        </w:tc>
+        <w:tc>
+          <w:tcPr>
+            <w:tcW w:type="dxa" w:w="4986"/>
+          </w:tcPr>
+          <w:p>
+            <w:r/>
+            <w:r>
+              <w:rPr>
+                <w:sz w:val="19"/>
+              </w:rPr>
+              <w:t>Help thử xong thì báo; app bật công tắc trên host rồi thử đầu-cuối: bấm dòng → khung trao đổi hiện trong 10 giây; gửi tin, dán ảnh; đổi trạng thái / tin mới → dòng trong bảng đổi theo không gọi lại cửa danh sách; để quá 60 phút → gia hạn không mất nháp; Đóng rồi mở lại còn nháp; lối lui khi chặn khung.</w:t>
+            </w:r>
+          </w:p>
+        </w:tc>
+      </w:tr>
+    </w:tbl>
+    <w:p/>
+    <w:p>
+      <w:pPr>
+        <w:pStyle w:val="Heading2"/>
+      </w:pPr>
+      <w:r>
+        <w:t>Phía app đã làm (11.4), chạy trên dữ liệu dựng thử</w:t>
+      </w:r>
+    </w:p>
+    <w:p>
+      <w:pPr>
+        <w:pStyle w:val="ListBullet"/>
+      </w:pPr>
+      <w:r>
+        <w:t>Popup: một nút "Gửi"; gửi xong iframe trao đổi chiếm chỗ vùng ảnh + ô mô tả (cao tối thiểu 60vh, bề ngang popup ≤ 900px nên iframe ≥ 600px như Help yêu cầu); thanh đầu giữ dòng ngữ cảnh, thêm mã yêu cầu và nhãn trạng thái.</w:t>
+      </w:r>
+    </w:p>
+    <w:p>
+      <w:pPr>
+        <w:pStyle w:val="ListBullet"/>
+      </w:pPr>
+      <w:r>
+        <w:t>Bảng "Yêu cầu của tôi": bấm dòng → popup trao đổi (POST token + id + v vào iframe). Nhận help-trang-thai → đổi nhãn trên popup và trên dòng (mã trạng thái lạ thì thêm vào danh mục chip); help-tin-moi → đổi số phản hồi chưa đọc trên dòng. Không gọi lại cửa danh sách.</w:t>
+      </w:r>
+    </w:p>
+    <w:p>
+      <w:pPr>
+        <w:pStyle w:val="ListBullet"/>
+      </w:pPr>
+      <w:r>
+        <w:t>App chỉ nhận message có event.origin đúng origin Help; mọi message chiều app → iframe gửi tới đúng origin Help, không dùng "*".</w:t>
+      </w:r>
+    </w:p>
+    <w:p>
+      <w:pPr>
+        <w:pStyle w:val="ListBullet"/>
+      </w:pPr>
+      <w:r>
+        <w:t>Lối lui: không có help-san-sang sau 10 giây (choMs) → thông báo trong popup kèm nút "Mở trong Help"; help-loi → hiện thongBao kèm nút đó.</w:t>
+      </w:r>
+    </w:p>
+    <w:p>
+      <w:pPr>
+        <w:pStyle w:val="ListBullet"/>
+      </w:pPr>
+      <w:r>
+        <w:t>Khi công tắc nhung tắt, phần mềm chạy y nguyên mục 10 (Gửi nhanh / Chi tiết hơn / bấm dòng mở tab) — đã kiểm lại cả hai chế độ bằng trang dò tự động, không lỗi JS.</w:t>
+      </w:r>
+    </w:p>
     <w:sectPr>
       <w:pgSz w:w="12240" w:h="15840"/>
       <w:pgMar w:top="1020" w:right="1134" w:bottom="1020" w:left="1134" w:header="720" w:footer="720" w:gutter="0"/>

</xml_diff>